<commit_message>
Modified: The parent class to include a constructor that requires the size.
Modified: The one base beverage class to pass all information off to the parent class. This servers as an example for students to create their own versions of base beverages.

Modified: The decorator class now also has a constructor to pass off information to the parent class. The size is based off the class it is decorating. Moved GetDescription method to the decorator class.
</commit_message>
<xml_diff>
--- a/DecoratorPattern/API 3 - 003 - Decorator Pattern.docx
+++ b/DecoratorPattern/API 3 - 003 - Decorator Pattern.docx
@@ -9,19 +9,12 @@
       <w:r>
         <w:t xml:space="preserve">API 3 – </w:t>
       </w:r>
-      <w:proofErr w:type="spellStart"/>
       <w:r>
         <w:t>Decorator</w:t>
       </w:r>
-      <w:proofErr w:type="spellEnd"/>
       <w:r>
-        <w:t xml:space="preserve"> </w:t>
+        <w:t xml:space="preserve"> Pattern</w:t>
       </w:r>
-      <w:proofErr w:type="spellStart"/>
-      <w:r>
-        <w:t>Pattern</w:t>
-      </w:r>
-      <w:proofErr w:type="spellEnd"/>
     </w:p>
     <w:tbl>
       <w:tblPr>
@@ -281,7 +274,10 @@
               <w:pStyle w:val="Plattetekst"/>
             </w:pPr>
             <w:r>
-              <w:t>5-10-2026</w:t>
+              <w:t>6</w:t>
+            </w:r>
+            <w:r>
+              <w:t>-10-2026</w:t>
             </w:r>
           </w:p>
         </w:tc>
@@ -323,15 +319,7 @@
               <w:pStyle w:val="Plattetekst"/>
             </w:pPr>
             <w:r>
-              <w:t xml:space="preserve">De codebase en dit document zijn voortaan te vinden in een GIT </w:t>
-            </w:r>
-            <w:proofErr w:type="spellStart"/>
-            <w:r>
-              <w:t>repository</w:t>
-            </w:r>
-            <w:proofErr w:type="spellEnd"/>
-            <w:r>
-              <w:t>. Link is toegevoegd</w:t>
+              <w:t>De codebase en dit document zijn voortaan te vinden in een GIT repository. Link is toegevoegd</w:t>
             </w:r>
           </w:p>
           <w:p>
@@ -347,32 +335,13 @@
               <w:pStyle w:val="Plattetekst"/>
             </w:pPr>
             <w:r>
-              <w:t xml:space="preserve">(Optionele) Opdracht 4 toegevoegd aan dit document. Deze opdracht gaat dieper in op de </w:t>
-            </w:r>
-            <w:proofErr w:type="gramStart"/>
-            <w:r>
-              <w:t>basis principes</w:t>
-            </w:r>
-            <w:proofErr w:type="gramEnd"/>
-            <w:r>
-              <w:t xml:space="preserve"> van OOP (</w:t>
-            </w:r>
-            <w:proofErr w:type="spellStart"/>
-            <w:r>
-              <w:t>Inheritance</w:t>
-            </w:r>
-            <w:proofErr w:type="spellEnd"/>
-            <w:r>
-              <w:t xml:space="preserve">) en maakt een sprongetje naar de Template Method </w:t>
-            </w:r>
-            <w:proofErr w:type="spellStart"/>
-            <w:r>
-              <w:t>Pattern</w:t>
-            </w:r>
-            <w:proofErr w:type="spellEnd"/>
-            <w:r>
-              <w:t>.</w:t>
-            </w:r>
+              <w:t>Opdracht 4 uitgebreid. Een lijst is nu toegevoegd om condiments te voorzien van een vaste prijs.</w:t>
+            </w:r>
+          </w:p>
+          <w:p>
+            <w:pPr>
+              <w:pStyle w:val="Plattetekst"/>
+            </w:pPr>
           </w:p>
         </w:tc>
       </w:tr>
@@ -414,9 +383,7 @@
             <w:rPr>
               <w:noProof/>
               <w:kern w:val="2"/>
-              <w:sz w:val="22"/>
-              <w:szCs w:val="22"/>
-              <w:lang/>
+              <w:lang w:eastAsia="nl-NL"/>
               <w14:ligatures w14:val="standardContextual"/>
             </w:rPr>
           </w:pPr>
@@ -429,7 +396,7 @@
           <w:r>
             <w:fldChar w:fldCharType="separate"/>
           </w:r>
-          <w:hyperlink w:anchor="_Toc144047731" w:history="1">
+          <w:hyperlink w:anchor="_Toc242184843" w:history="1">
             <w:r>
               <w:rPr>
                 <w:rStyle w:val="Hyperlink"/>
@@ -456,7 +423,7 @@
                 <w:noProof/>
                 <w:webHidden/>
               </w:rPr>
-              <w:instrText xml:space="preserve"> PAGEREF _Toc144047731 \h </w:instrText>
+              <w:instrText xml:space="preserve"> PAGEREF _Toc242184843 \h </w:instrText>
             </w:r>
             <w:r>
               <w:rPr>
@@ -476,7 +443,7 @@
                 <w:noProof/>
                 <w:webHidden/>
               </w:rPr>
-              <w:t>3</w:t>
+              <w:t>2</w:t>
             </w:r>
             <w:r>
               <w:rPr>
@@ -496,13 +463,11 @@
             <w:rPr>
               <w:noProof/>
               <w:kern w:val="2"/>
-              <w:sz w:val="22"/>
-              <w:szCs w:val="22"/>
-              <w:lang/>
+              <w:lang w:eastAsia="nl-NL"/>
               <w14:ligatures w14:val="standardContextual"/>
             </w:rPr>
           </w:pPr>
-          <w:hyperlink w:anchor="_Toc144047732" w:history="1">
+          <w:hyperlink w:anchor="_Toc242184844" w:history="1">
             <w:r>
               <w:rPr>
                 <w:rStyle w:val="Hyperlink"/>
@@ -529,7 +494,7 @@
                 <w:noProof/>
                 <w:webHidden/>
               </w:rPr>
-              <w:instrText xml:space="preserve"> PAGEREF _Toc144047732 \h </w:instrText>
+              <w:instrText xml:space="preserve"> PAGEREF _Toc242184844 \h </w:instrText>
             </w:r>
             <w:r>
               <w:rPr>
@@ -549,7 +514,7 @@
                 <w:noProof/>
                 <w:webHidden/>
               </w:rPr>
-              <w:t>4</w:t>
+              <w:t>3</w:t>
             </w:r>
             <w:r>
               <w:rPr>
@@ -569,13 +534,11 @@
             <w:rPr>
               <w:noProof/>
               <w:kern w:val="2"/>
-              <w:sz w:val="22"/>
-              <w:szCs w:val="22"/>
-              <w:lang/>
+              <w:lang w:eastAsia="nl-NL"/>
               <w14:ligatures w14:val="standardContextual"/>
             </w:rPr>
           </w:pPr>
-          <w:hyperlink w:anchor="_Toc144047733" w:history="1">
+          <w:hyperlink w:anchor="_Toc242184845" w:history="1">
             <w:r>
               <w:rPr>
                 <w:rStyle w:val="Hyperlink"/>
@@ -602,7 +565,7 @@
                 <w:noProof/>
                 <w:webHidden/>
               </w:rPr>
-              <w:instrText xml:space="preserve"> PAGEREF _Toc144047733 \h </w:instrText>
+              <w:instrText xml:space="preserve"> PAGEREF _Toc242184845 \h </w:instrText>
             </w:r>
             <w:r>
               <w:rPr>
@@ -622,7 +585,7 @@
                 <w:noProof/>
                 <w:webHidden/>
               </w:rPr>
-              <w:t>5</w:t>
+              <w:t>4</w:t>
             </w:r>
             <w:r>
               <w:rPr>
@@ -642,13 +605,11 @@
             <w:rPr>
               <w:noProof/>
               <w:kern w:val="2"/>
-              <w:sz w:val="22"/>
-              <w:szCs w:val="22"/>
-              <w:lang/>
+              <w:lang w:eastAsia="nl-NL"/>
               <w14:ligatures w14:val="standardContextual"/>
             </w:rPr>
           </w:pPr>
-          <w:hyperlink w:anchor="_Toc144047734" w:history="1">
+          <w:hyperlink w:anchor="_Toc242184846" w:history="1">
             <w:r>
               <w:rPr>
                 <w:rStyle w:val="Hyperlink"/>
@@ -675,7 +636,7 @@
                 <w:noProof/>
                 <w:webHidden/>
               </w:rPr>
-              <w:instrText xml:space="preserve"> PAGEREF _Toc144047734 \h </w:instrText>
+              <w:instrText xml:space="preserve"> PAGEREF _Toc242184846 \h </w:instrText>
             </w:r>
             <w:r>
               <w:rPr>
@@ -695,7 +656,7 @@
                 <w:noProof/>
                 <w:webHidden/>
               </w:rPr>
-              <w:t>5</w:t>
+              <w:t>4</w:t>
             </w:r>
             <w:r>
               <w:rPr>
@@ -720,7 +681,7 @@
       <w:r>
         <w:br w:type="page"/>
       </w:r>
-      <w:bookmarkStart w:id="0" w:name="_Toc144047731"/>
+      <w:bookmarkStart w:id="0" w:name="_Toc242184843"/>
       <w:r>
         <w:lastRenderedPageBreak/>
         <w:t>Opdracht #1</w:t>
@@ -729,58 +690,6 @@
         <w:t xml:space="preserve"> – Setting up</w:t>
       </w:r>
       <w:bookmarkEnd w:id="0"/>
-    </w:p>
-    <w:p>
-      <w:pPr>
-        <w:pStyle w:val="Geenafstand"/>
-        <w:numPr>
-          <w:ilvl w:val="0"/>
-          <w:numId w:val="16"/>
-        </w:numPr>
-      </w:pPr>
-      <w:r>
-        <w:t>Download het mapje “</w:t>
-      </w:r>
-      <w:proofErr w:type="spellStart"/>
-      <w:r>
-        <w:t>Decorator</w:t>
-      </w:r>
-      <w:proofErr w:type="spellEnd"/>
-      <w:r>
-        <w:t xml:space="preserve"> Pattern</w:t>
-      </w:r>
-      <w:r>
-        <w:t>.zip</w:t>
-      </w:r>
-      <w:r>
-        <w:t>” van Teams</w:t>
-      </w:r>
-      <w:r>
-        <w:t xml:space="preserve"> en pak uit</w:t>
-      </w:r>
-    </w:p>
-    <w:p>
-      <w:pPr>
-        <w:pStyle w:val="Geenafstand"/>
-        <w:numPr>
-          <w:ilvl w:val="0"/>
-          <w:numId w:val="16"/>
-        </w:numPr>
-      </w:pPr>
-      <w:r>
-        <w:t>Open het .</w:t>
-      </w:r>
-      <w:proofErr w:type="spellStart"/>
-      <w:r>
-        <w:t>csproj</w:t>
-      </w:r>
-      <w:proofErr w:type="spellEnd"/>
-      <w:r>
-        <w:t xml:space="preserve"> bestand met Visual Studio (niet Visual Studio Code)</w:t>
-      </w:r>
-      <w:r>
-        <w:tab/>
-      </w:r>
     </w:p>
     <w:p>
       <w:pPr>
@@ -868,76 +777,105 @@
       <w:pPr>
         <w:pStyle w:val="Kop1"/>
       </w:pPr>
-      <w:bookmarkStart w:id="1" w:name="_Toc144047732"/>
+      <w:bookmarkStart w:id="1" w:name="_Toc242184844"/>
       <w:r>
         <w:lastRenderedPageBreak/>
         <w:t>Opdracht #2</w:t>
       </w:r>
       <w:r>
-        <w:t xml:space="preserve"> – </w:t>
-      </w:r>
-      <w:proofErr w:type="spellStart"/>
-      <w:r>
-        <w:t>Implementing</w:t>
-      </w:r>
-      <w:proofErr w:type="spellEnd"/>
-      <w:r>
-        <w:t xml:space="preserve"> interfaces</w:t>
+        <w:t xml:space="preserve"> – Implementing interfaces</w:t>
       </w:r>
       <w:bookmarkEnd w:id="1"/>
     </w:p>
     <w:p>
+      <w:pPr>
+        <w:rPr>
+          <w:sz w:val="28"/>
+          <w:szCs w:val="28"/>
+        </w:rPr>
+      </w:pPr>
       <w:r>
+        <w:rPr>
+          <w:sz w:val="28"/>
+          <w:szCs w:val="28"/>
+        </w:rPr>
         <w:t xml:space="preserve">Bekijk de volgende </w:t>
       </w:r>
       <w:r>
+        <w:rPr>
+          <w:sz w:val="28"/>
+          <w:szCs w:val="28"/>
+        </w:rPr>
         <w:t>tabel</w:t>
       </w:r>
       <w:r>
+        <w:rPr>
+          <w:sz w:val="28"/>
+          <w:szCs w:val="28"/>
+        </w:rPr>
         <w:t>:</w:t>
       </w:r>
     </w:p>
     <w:p>
+      <w:pPr>
+        <w:rPr>
+          <w:sz w:val="28"/>
+          <w:szCs w:val="28"/>
+        </w:rPr>
+      </w:pPr>
       <w:r>
+        <w:rPr>
+          <w:sz w:val="28"/>
+          <w:szCs w:val="28"/>
+        </w:rPr>
         <w:t xml:space="preserve">Vul de code aan met de volgende “base” </w:t>
       </w:r>
-      <w:proofErr w:type="spellStart"/>
       <w:r>
         <w:rPr>
           <w:b/>
           <w:bCs/>
+          <w:sz w:val="28"/>
+          <w:szCs w:val="28"/>
         </w:rPr>
         <w:t>beverages</w:t>
       </w:r>
-      <w:proofErr w:type="spellEnd"/>
       <w:r>
+        <w:rPr>
+          <w:sz w:val="28"/>
+          <w:szCs w:val="28"/>
+        </w:rPr>
         <w:t xml:space="preserve"> en de volgende </w:t>
       </w:r>
-      <w:proofErr w:type="spellStart"/>
       <w:r>
         <w:rPr>
           <w:b/>
           <w:bCs/>
+          <w:sz w:val="28"/>
+          <w:szCs w:val="28"/>
         </w:rPr>
         <w:t>condiments</w:t>
       </w:r>
-      <w:proofErr w:type="spellEnd"/>
       <w:r>
         <w:rPr>
           <w:b/>
           <w:bCs/>
+          <w:sz w:val="28"/>
+          <w:szCs w:val="28"/>
         </w:rPr>
         <w:t xml:space="preserve">. </w:t>
       </w:r>
       <w:r>
-        <w:t xml:space="preserve">Verzin zelf een toepasselijke prijs voor iedere “base” of </w:t>
+        <w:rPr>
+          <w:sz w:val="28"/>
+          <w:szCs w:val="28"/>
+        </w:rPr>
+        <w:t>Verzin zelf een toepasselijke prijs voor iedere “base” of condiment</w:t>
       </w:r>
-      <w:proofErr w:type="spellStart"/>
       <w:r>
-        <w:t>condiment</w:t>
-      </w:r>
-      <w:proofErr w:type="spellEnd"/>
-      <w:r>
+        <w:rPr>
+          <w:sz w:val="28"/>
+          <w:szCs w:val="28"/>
+        </w:rPr>
         <w:t>.</w:t>
       </w:r>
     </w:p>
@@ -966,13 +904,8 @@
           </w:tcPr>
           <w:p>
             <w:r>
-              <w:t xml:space="preserve">Coffee </w:t>
-            </w:r>
-            <w:proofErr w:type="spellStart"/>
-            <w:r>
-              <w:t>mixes</w:t>
-            </w:r>
-            <w:proofErr w:type="spellEnd"/>
+              <w:t>Coffee mixes</w:t>
+            </w:r>
           </w:p>
         </w:tc>
         <w:tc>
@@ -1001,11 +934,9 @@
             <w:pPr>
               <w:cnfStyle w:val="100000000000" w:firstRow="1" w:lastRow="0" w:firstColumn="0" w:lastColumn="0" w:oddVBand="0" w:evenVBand="0" w:oddHBand="0" w:evenHBand="0" w:firstRowFirstColumn="0" w:firstRowLastColumn="0" w:lastRowFirstColumn="0" w:lastRowLastColumn="0"/>
             </w:pPr>
-            <w:proofErr w:type="spellStart"/>
             <w:r>
               <w:t>Condiments</w:t>
             </w:r>
-            <w:proofErr w:type="spellEnd"/>
           </w:p>
         </w:tc>
       </w:tr>
@@ -1085,11 +1016,9 @@
             <w:tcW w:w="0" w:type="auto"/>
           </w:tcPr>
           <w:p>
-            <w:proofErr w:type="spellStart"/>
             <w:r>
               <w:t>Doppio</w:t>
             </w:r>
-            <w:proofErr w:type="spellEnd"/>
           </w:p>
         </w:tc>
         <w:tc>
@@ -1159,11 +1088,9 @@
             <w:tcW w:w="0" w:type="auto"/>
           </w:tcPr>
           <w:p>
-            <w:proofErr w:type="spellStart"/>
             <w:r>
               <w:t>Lungo</w:t>
             </w:r>
-            <w:proofErr w:type="spellEnd"/>
           </w:p>
         </w:tc>
         <w:tc>
@@ -1230,11 +1157,9 @@
             <w:tcW w:w="0" w:type="auto"/>
           </w:tcPr>
           <w:p>
-            <w:proofErr w:type="spellStart"/>
             <w:r>
               <w:t>Macchiato</w:t>
             </w:r>
-            <w:proofErr w:type="spellEnd"/>
           </w:p>
         </w:tc>
         <w:tc>
@@ -1258,19 +1183,9 @@
             <w:pPr>
               <w:cnfStyle w:val="000000000000" w:firstRow="0" w:lastRow="0" w:firstColumn="0" w:lastColumn="0" w:oddVBand="0" w:evenVBand="0" w:oddHBand="0" w:evenHBand="0" w:firstRowFirstColumn="0" w:firstRowLastColumn="0" w:lastRowFirstColumn="0" w:lastRowLastColumn="0"/>
             </w:pPr>
-            <w:proofErr w:type="spellStart"/>
-            <w:r>
-              <w:t>Milk</w:t>
-            </w:r>
-            <w:proofErr w:type="spellEnd"/>
-            <w:r>
-              <w:t xml:space="preserve"> </w:t>
-            </w:r>
-            <w:proofErr w:type="spellStart"/>
-            <w:r>
-              <w:t>Foam</w:t>
-            </w:r>
-            <w:proofErr w:type="spellEnd"/>
+            <w:r>
+              <w:t>Milk Foam</w:t>
+            </w:r>
           </w:p>
         </w:tc>
         <w:tc>
@@ -1314,11 +1229,9 @@
             <w:tcW w:w="0" w:type="auto"/>
           </w:tcPr>
           <w:p>
-            <w:proofErr w:type="spellStart"/>
             <w:r>
               <w:t>Corretta</w:t>
             </w:r>
-            <w:proofErr w:type="spellEnd"/>
           </w:p>
         </w:tc>
         <w:tc>
@@ -1342,11 +1255,9 @@
             <w:pPr>
               <w:cnfStyle w:val="000000100000" w:firstRow="0" w:lastRow="0" w:firstColumn="0" w:lastColumn="0" w:oddVBand="0" w:evenVBand="0" w:oddHBand="1" w:evenHBand="0" w:firstRowFirstColumn="0" w:firstRowLastColumn="0" w:lastRowFirstColumn="0" w:lastRowLastColumn="0"/>
             </w:pPr>
-            <w:proofErr w:type="spellStart"/>
             <w:r>
               <w:t>Liqour</w:t>
             </w:r>
-            <w:proofErr w:type="spellEnd"/>
           </w:p>
         </w:tc>
         <w:tc>
@@ -1388,13 +1299,8 @@
           </w:tcPr>
           <w:p>
             <w:r>
-              <w:t xml:space="preserve">Con </w:t>
-            </w:r>
-            <w:proofErr w:type="spellStart"/>
-            <w:r>
-              <w:t>Panna</w:t>
-            </w:r>
-            <w:proofErr w:type="spellEnd"/>
+              <w:t>Con Panna</w:t>
+            </w:r>
           </w:p>
         </w:tc>
         <w:tc>
@@ -1418,11 +1324,9 @@
             <w:pPr>
               <w:cnfStyle w:val="000000000000" w:firstRow="0" w:lastRow="0" w:firstColumn="0" w:lastColumn="0" w:oddVBand="0" w:evenVBand="0" w:oddHBand="0" w:evenHBand="0" w:firstRowFirstColumn="0" w:firstRowLastColumn="0" w:lastRowFirstColumn="0" w:lastRowLastColumn="0"/>
             </w:pPr>
-            <w:proofErr w:type="spellStart"/>
             <w:r>
               <w:t>Whip</w:t>
             </w:r>
-            <w:proofErr w:type="spellEnd"/>
           </w:p>
         </w:tc>
         <w:tc>
@@ -1466,11 +1370,9 @@
             <w:tcW w:w="0" w:type="auto"/>
           </w:tcPr>
           <w:p>
-            <w:proofErr w:type="spellStart"/>
             <w:r>
               <w:t>Cappucinno</w:t>
             </w:r>
-            <w:proofErr w:type="spellEnd"/>
           </w:p>
         </w:tc>
         <w:tc>
@@ -1494,19 +1396,9 @@
             <w:pPr>
               <w:cnfStyle w:val="000000100000" w:firstRow="0" w:lastRow="0" w:firstColumn="0" w:lastColumn="0" w:oddVBand="0" w:evenVBand="0" w:oddHBand="1" w:evenHBand="0" w:firstRowFirstColumn="0" w:firstRowLastColumn="0" w:lastRowFirstColumn="0" w:lastRowLastColumn="0"/>
             </w:pPr>
-            <w:proofErr w:type="spellStart"/>
-            <w:r>
-              <w:t>Steamed</w:t>
-            </w:r>
-            <w:proofErr w:type="spellEnd"/>
-            <w:r>
-              <w:t xml:space="preserve"> </w:t>
-            </w:r>
-            <w:proofErr w:type="spellStart"/>
-            <w:r>
-              <w:t>Milk</w:t>
-            </w:r>
-            <w:proofErr w:type="spellEnd"/>
+            <w:r>
+              <w:t>Steamed Milk</w:t>
+            </w:r>
           </w:p>
         </w:tc>
         <w:tc>
@@ -1517,19 +1409,9 @@
             <w:pPr>
               <w:cnfStyle w:val="000000100000" w:firstRow="0" w:lastRow="0" w:firstColumn="0" w:lastColumn="0" w:oddVBand="0" w:evenVBand="0" w:oddHBand="1" w:evenHBand="0" w:firstRowFirstColumn="0" w:firstRowLastColumn="0" w:lastRowFirstColumn="0" w:lastRowLastColumn="0"/>
             </w:pPr>
-            <w:proofErr w:type="spellStart"/>
-            <w:r>
-              <w:t>Milk</w:t>
-            </w:r>
-            <w:proofErr w:type="spellEnd"/>
-            <w:r>
-              <w:t xml:space="preserve"> </w:t>
-            </w:r>
-            <w:proofErr w:type="spellStart"/>
-            <w:r>
-              <w:t>Foam</w:t>
-            </w:r>
-            <w:proofErr w:type="spellEnd"/>
+            <w:r>
+              <w:t>Milk Foam</w:t>
+            </w:r>
           </w:p>
         </w:tc>
         <w:tc>
@@ -1560,11 +1442,9 @@
             <w:tcW w:w="0" w:type="auto"/>
           </w:tcPr>
           <w:p>
-            <w:proofErr w:type="spellStart"/>
             <w:r>
               <w:t>Americano</w:t>
             </w:r>
-            <w:proofErr w:type="spellEnd"/>
           </w:p>
         </w:tc>
         <w:tc>
@@ -1637,13 +1517,8 @@
             <w:tcW w:w="0" w:type="auto"/>
           </w:tcPr>
           <w:p>
-            <w:proofErr w:type="spellStart"/>
-            <w:r>
-              <w:t>Caffé</w:t>
-            </w:r>
-            <w:proofErr w:type="spellEnd"/>
-            <w:r>
-              <w:t xml:space="preserve"> Latte</w:t>
+            <w:r>
+              <w:t>Caffé Latte</w:t>
             </w:r>
           </w:p>
         </w:tc>
@@ -1668,19 +1543,9 @@
             <w:pPr>
               <w:cnfStyle w:val="000000100000" w:firstRow="0" w:lastRow="0" w:firstColumn="0" w:lastColumn="0" w:oddVBand="0" w:evenVBand="0" w:oddHBand="1" w:evenHBand="0" w:firstRowFirstColumn="0" w:firstRowLastColumn="0" w:lastRowFirstColumn="0" w:lastRowLastColumn="0"/>
             </w:pPr>
-            <w:proofErr w:type="spellStart"/>
-            <w:r>
-              <w:t>Steamed</w:t>
-            </w:r>
-            <w:proofErr w:type="spellEnd"/>
-            <w:r>
-              <w:t xml:space="preserve"> </w:t>
-            </w:r>
-            <w:proofErr w:type="spellStart"/>
-            <w:r>
-              <w:t>Milk</w:t>
-            </w:r>
-            <w:proofErr w:type="spellEnd"/>
+            <w:r>
+              <w:t>Steamed Milk</w:t>
+            </w:r>
           </w:p>
         </w:tc>
         <w:tc>
@@ -1691,19 +1556,9 @@
             <w:pPr>
               <w:cnfStyle w:val="000000100000" w:firstRow="0" w:lastRow="0" w:firstColumn="0" w:lastColumn="0" w:oddVBand="0" w:evenVBand="0" w:oddHBand="1" w:evenHBand="0" w:firstRowFirstColumn="0" w:firstRowLastColumn="0" w:lastRowFirstColumn="0" w:lastRowLastColumn="0"/>
             </w:pPr>
-            <w:proofErr w:type="spellStart"/>
-            <w:r>
-              <w:t>Steamed</w:t>
-            </w:r>
-            <w:proofErr w:type="spellEnd"/>
-            <w:r>
-              <w:t xml:space="preserve"> </w:t>
-            </w:r>
-            <w:proofErr w:type="spellStart"/>
-            <w:r>
-              <w:t>Milk</w:t>
-            </w:r>
-            <w:proofErr w:type="spellEnd"/>
+            <w:r>
+              <w:t>Steamed Milk</w:t>
+            </w:r>
           </w:p>
         </w:tc>
         <w:tc>
@@ -1714,19 +1569,9 @@
             <w:pPr>
               <w:cnfStyle w:val="000000100000" w:firstRow="0" w:lastRow="0" w:firstColumn="0" w:lastColumn="0" w:oddVBand="0" w:evenVBand="0" w:oddHBand="1" w:evenHBand="0" w:firstRowFirstColumn="0" w:firstRowLastColumn="0" w:lastRowFirstColumn="0" w:lastRowLastColumn="0"/>
             </w:pPr>
-            <w:proofErr w:type="spellStart"/>
-            <w:r>
-              <w:t>Milk</w:t>
-            </w:r>
-            <w:proofErr w:type="spellEnd"/>
-            <w:r>
-              <w:t xml:space="preserve"> </w:t>
-            </w:r>
-            <w:proofErr w:type="spellStart"/>
-            <w:r>
-              <w:t>Foam</w:t>
-            </w:r>
-            <w:proofErr w:type="spellEnd"/>
+            <w:r>
+              <w:t>Milk Foam</w:t>
+            </w:r>
           </w:p>
         </w:tc>
         <w:tc>
@@ -1773,19 +1618,9 @@
             <w:pPr>
               <w:cnfStyle w:val="000000000000" w:firstRow="0" w:lastRow="0" w:firstColumn="0" w:lastColumn="0" w:oddVBand="0" w:evenVBand="0" w:oddHBand="0" w:evenHBand="0" w:firstRowFirstColumn="0" w:firstRowLastColumn="0" w:lastRowFirstColumn="0" w:lastRowLastColumn="0"/>
             </w:pPr>
-            <w:proofErr w:type="spellStart"/>
-            <w:r>
-              <w:t>Steamed</w:t>
-            </w:r>
-            <w:proofErr w:type="spellEnd"/>
-            <w:r>
-              <w:t xml:space="preserve"> </w:t>
-            </w:r>
-            <w:proofErr w:type="spellStart"/>
-            <w:r>
-              <w:t>Milk</w:t>
-            </w:r>
-            <w:proofErr w:type="spellEnd"/>
+            <w:r>
+              <w:t>Steamed Milk</w:t>
+            </w:r>
           </w:p>
         </w:tc>
         <w:tc>
@@ -1796,19 +1631,9 @@
             <w:pPr>
               <w:cnfStyle w:val="000000000000" w:firstRow="0" w:lastRow="0" w:firstColumn="0" w:lastColumn="0" w:oddVBand="0" w:evenVBand="0" w:oddHBand="0" w:evenHBand="0" w:firstRowFirstColumn="0" w:firstRowLastColumn="0" w:lastRowFirstColumn="0" w:lastRowLastColumn="0"/>
             </w:pPr>
-            <w:proofErr w:type="spellStart"/>
-            <w:r>
-              <w:t>Steamed</w:t>
-            </w:r>
-            <w:proofErr w:type="spellEnd"/>
-            <w:r>
-              <w:t xml:space="preserve"> </w:t>
-            </w:r>
-            <w:proofErr w:type="spellStart"/>
-            <w:r>
-              <w:t>Milk</w:t>
-            </w:r>
-            <w:proofErr w:type="spellEnd"/>
+            <w:r>
+              <w:t>Steamed Milk</w:t>
+            </w:r>
           </w:p>
         </w:tc>
         <w:tc>
@@ -1911,11 +1736,9 @@
             <w:tcW w:w="0" w:type="auto"/>
           </w:tcPr>
           <w:p>
-            <w:proofErr w:type="spellStart"/>
             <w:r>
               <w:t>Morocchino</w:t>
             </w:r>
-            <w:proofErr w:type="spellEnd"/>
           </w:p>
         </w:tc>
         <w:tc>
@@ -1952,19 +1775,9 @@
             <w:pPr>
               <w:cnfStyle w:val="000000000000" w:firstRow="0" w:lastRow="0" w:firstColumn="0" w:lastColumn="0" w:oddVBand="0" w:evenVBand="0" w:oddHBand="0" w:evenHBand="0" w:firstRowFirstColumn="0" w:firstRowLastColumn="0" w:lastRowFirstColumn="0" w:lastRowLastColumn="0"/>
             </w:pPr>
-            <w:proofErr w:type="spellStart"/>
-            <w:r>
-              <w:t>Milk</w:t>
-            </w:r>
-            <w:proofErr w:type="spellEnd"/>
-            <w:r>
-              <w:t xml:space="preserve"> </w:t>
-            </w:r>
-            <w:proofErr w:type="spellStart"/>
-            <w:r>
-              <w:t>Foam</w:t>
-            </w:r>
-            <w:proofErr w:type="spellEnd"/>
+            <w:r>
+              <w:t>Milk Foam</w:t>
+            </w:r>
           </w:p>
         </w:tc>
         <w:tc>
@@ -1998,11 +1811,9 @@
             <w:tcW w:w="0" w:type="auto"/>
           </w:tcPr>
           <w:p>
-            <w:proofErr w:type="spellStart"/>
             <w:r>
               <w:t>Mocha</w:t>
             </w:r>
-            <w:proofErr w:type="spellEnd"/>
           </w:p>
         </w:tc>
         <w:tc>
@@ -2039,19 +1850,9 @@
             <w:pPr>
               <w:cnfStyle w:val="000000100000" w:firstRow="0" w:lastRow="0" w:firstColumn="0" w:lastColumn="0" w:oddVBand="0" w:evenVBand="0" w:oddHBand="1" w:evenHBand="0" w:firstRowFirstColumn="0" w:firstRowLastColumn="0" w:lastRowFirstColumn="0" w:lastRowLastColumn="0"/>
             </w:pPr>
-            <w:proofErr w:type="spellStart"/>
-            <w:r>
-              <w:t>Steamed</w:t>
-            </w:r>
-            <w:proofErr w:type="spellEnd"/>
-            <w:r>
-              <w:t xml:space="preserve"> </w:t>
-            </w:r>
-            <w:proofErr w:type="spellStart"/>
-            <w:r>
-              <w:t>Milk</w:t>
-            </w:r>
-            <w:proofErr w:type="spellEnd"/>
+            <w:r>
+              <w:t>Steamed Milk</w:t>
+            </w:r>
           </w:p>
         </w:tc>
         <w:tc>
@@ -2062,11 +1863,9 @@
             <w:pPr>
               <w:cnfStyle w:val="000000100000" w:firstRow="0" w:lastRow="0" w:firstColumn="0" w:lastColumn="0" w:oddVBand="0" w:evenVBand="0" w:oddHBand="1" w:evenHBand="0" w:firstRowFirstColumn="0" w:firstRowLastColumn="0" w:lastRowFirstColumn="0" w:lastRowLastColumn="0"/>
             </w:pPr>
-            <w:proofErr w:type="spellStart"/>
             <w:r>
               <w:t>Whip</w:t>
             </w:r>
-            <w:proofErr w:type="spellEnd"/>
           </w:p>
         </w:tc>
         <w:tc>
@@ -2087,11 +1886,9 @@
             <w:tcW w:w="0" w:type="auto"/>
           </w:tcPr>
           <w:p>
-            <w:proofErr w:type="spellStart"/>
             <w:r>
               <w:t>Bicerin</w:t>
             </w:r>
-            <w:proofErr w:type="spellEnd"/>
           </w:p>
         </w:tc>
         <w:tc>
@@ -2141,11 +1938,9 @@
             <w:pPr>
               <w:cnfStyle w:val="000000000000" w:firstRow="0" w:lastRow="0" w:firstColumn="0" w:lastColumn="0" w:oddVBand="0" w:evenVBand="0" w:oddHBand="0" w:evenHBand="0" w:firstRowFirstColumn="0" w:firstRowLastColumn="0" w:lastRowFirstColumn="0" w:lastRowLastColumn="0"/>
             </w:pPr>
-            <w:proofErr w:type="spellStart"/>
             <w:r>
               <w:t>Whip</w:t>
             </w:r>
-            <w:proofErr w:type="spellEnd"/>
           </w:p>
         </w:tc>
         <w:tc>
@@ -2195,19 +1990,9 @@
             <w:pPr>
               <w:cnfStyle w:val="000000100000" w:firstRow="0" w:lastRow="0" w:firstColumn="0" w:lastColumn="0" w:oddVBand="0" w:evenVBand="0" w:oddHBand="1" w:evenHBand="0" w:firstRowFirstColumn="0" w:firstRowLastColumn="0" w:lastRowFirstColumn="0" w:lastRowLastColumn="0"/>
             </w:pPr>
-            <w:proofErr w:type="spellStart"/>
-            <w:r>
-              <w:t>Milk</w:t>
-            </w:r>
-            <w:proofErr w:type="spellEnd"/>
-            <w:r>
-              <w:t xml:space="preserve"> </w:t>
-            </w:r>
-            <w:proofErr w:type="spellStart"/>
-            <w:r>
-              <w:t>Foam</w:t>
-            </w:r>
-            <w:proofErr w:type="spellEnd"/>
+            <w:r>
+              <w:t>Milk Foam</w:t>
+            </w:r>
           </w:p>
         </w:tc>
         <w:tc>
@@ -2219,13 +2004,8 @@
               <w:cnfStyle w:val="000000100000" w:firstRow="0" w:lastRow="0" w:firstColumn="0" w:lastColumn="0" w:oddVBand="0" w:evenVBand="0" w:oddHBand="1" w:evenHBand="0" w:firstRowFirstColumn="0" w:firstRowLastColumn="0" w:lastRowFirstColumn="0" w:lastRowLastColumn="0"/>
             </w:pPr>
             <w:r>
-              <w:t xml:space="preserve">Half </w:t>
-            </w:r>
-            <w:proofErr w:type="spellStart"/>
-            <w:r>
-              <w:t>Milk</w:t>
-            </w:r>
-            <w:proofErr w:type="spellEnd"/>
+              <w:t>Half Milk</w:t>
+            </w:r>
           </w:p>
         </w:tc>
         <w:tc>
@@ -2256,13 +2036,8 @@
             <w:tcW w:w="0" w:type="auto"/>
           </w:tcPr>
           <w:p>
-            <w:proofErr w:type="spellStart"/>
-            <w:r>
-              <w:t>Raf</w:t>
-            </w:r>
-            <w:proofErr w:type="spellEnd"/>
-            <w:r>
-              <w:t xml:space="preserve"> coffee</w:t>
+            <w:r>
+              <w:t>Raf coffee</w:t>
             </w:r>
           </w:p>
         </w:tc>
@@ -2287,13 +2062,8 @@
             <w:pPr>
               <w:cnfStyle w:val="000000000000" w:firstRow="0" w:lastRow="0" w:firstColumn="0" w:lastColumn="0" w:oddVBand="0" w:evenVBand="0" w:oddHBand="0" w:evenHBand="0" w:firstRowFirstColumn="0" w:firstRowLastColumn="0" w:lastRowFirstColumn="0" w:lastRowLastColumn="0"/>
             </w:pPr>
-            <w:proofErr w:type="spellStart"/>
-            <w:r>
-              <w:t>Vanilla</w:t>
-            </w:r>
-            <w:proofErr w:type="spellEnd"/>
-            <w:r>
-              <w:t xml:space="preserve"> Sugar</w:t>
+            <w:r>
+              <w:t>Vanilla Sugar</w:t>
             </w:r>
           </w:p>
         </w:tc>
@@ -2341,19 +2111,9 @@
             <w:tcW w:w="0" w:type="auto"/>
           </w:tcPr>
           <w:p>
-            <w:proofErr w:type="spellStart"/>
-            <w:r>
-              <w:t>Mead</w:t>
-            </w:r>
-            <w:proofErr w:type="spellEnd"/>
-            <w:r>
-              <w:t xml:space="preserve"> </w:t>
-            </w:r>
-            <w:proofErr w:type="spellStart"/>
-            <w:r>
-              <w:t>raf</w:t>
-            </w:r>
-            <w:proofErr w:type="spellEnd"/>
+            <w:r>
+              <w:t>Mead raf</w:t>
+            </w:r>
           </w:p>
         </w:tc>
         <w:tc>
@@ -2377,11 +2137,9 @@
             <w:pPr>
               <w:cnfStyle w:val="000000100000" w:firstRow="0" w:lastRow="0" w:firstColumn="0" w:lastColumn="0" w:oddVBand="0" w:evenVBand="0" w:oddHBand="1" w:evenHBand="0" w:firstRowFirstColumn="0" w:firstRowLastColumn="0" w:lastRowFirstColumn="0" w:lastRowLastColumn="0"/>
             </w:pPr>
-            <w:proofErr w:type="spellStart"/>
             <w:r>
               <w:t>Honey</w:t>
             </w:r>
-            <w:proofErr w:type="spellEnd"/>
           </w:p>
         </w:tc>
         <w:tc>
@@ -2425,11 +2183,9 @@
             <w:tcW w:w="0" w:type="auto"/>
           </w:tcPr>
           <w:p>
-            <w:proofErr w:type="spellStart"/>
             <w:r>
               <w:t>Galao</w:t>
             </w:r>
-            <w:proofErr w:type="spellEnd"/>
           </w:p>
         </w:tc>
         <w:tc>
@@ -2453,19 +2209,9 @@
             <w:pPr>
               <w:cnfStyle w:val="000000000000" w:firstRow="0" w:lastRow="0" w:firstColumn="0" w:lastColumn="0" w:oddVBand="0" w:evenVBand="0" w:oddHBand="0" w:evenHBand="0" w:firstRowFirstColumn="0" w:firstRowLastColumn="0" w:lastRowFirstColumn="0" w:lastRowLastColumn="0"/>
             </w:pPr>
-            <w:proofErr w:type="spellStart"/>
-            <w:r>
-              <w:t>Milk</w:t>
-            </w:r>
-            <w:proofErr w:type="spellEnd"/>
-            <w:r>
-              <w:t xml:space="preserve"> </w:t>
-            </w:r>
-            <w:proofErr w:type="spellStart"/>
-            <w:r>
-              <w:t>Foam</w:t>
-            </w:r>
-            <w:proofErr w:type="spellEnd"/>
+            <w:r>
+              <w:t>Milk Foam</w:t>
+            </w:r>
           </w:p>
         </w:tc>
         <w:tc>
@@ -2476,19 +2222,9 @@
             <w:pPr>
               <w:cnfStyle w:val="000000000000" w:firstRow="0" w:lastRow="0" w:firstColumn="0" w:lastColumn="0" w:oddVBand="0" w:evenVBand="0" w:oddHBand="0" w:evenHBand="0" w:firstRowFirstColumn="0" w:firstRowLastColumn="0" w:lastRowFirstColumn="0" w:lastRowLastColumn="0"/>
             </w:pPr>
-            <w:proofErr w:type="spellStart"/>
-            <w:r>
-              <w:t>Milk</w:t>
-            </w:r>
-            <w:proofErr w:type="spellEnd"/>
-            <w:r>
-              <w:t xml:space="preserve"> </w:t>
-            </w:r>
-            <w:proofErr w:type="spellStart"/>
-            <w:r>
-              <w:t>Foam</w:t>
-            </w:r>
-            <w:proofErr w:type="spellEnd"/>
+            <w:r>
+              <w:t>Milk Foam</w:t>
+            </w:r>
           </w:p>
         </w:tc>
         <w:tc>
@@ -2522,19 +2258,9 @@
             <w:tcW w:w="0" w:type="auto"/>
           </w:tcPr>
           <w:p>
-            <w:proofErr w:type="spellStart"/>
-            <w:r>
-              <w:t>Caffé</w:t>
-            </w:r>
-            <w:proofErr w:type="spellEnd"/>
-            <w:r>
-              <w:t xml:space="preserve"> </w:t>
-            </w:r>
-            <w:proofErr w:type="spellStart"/>
-            <w:r>
-              <w:t>affogato</w:t>
-            </w:r>
-            <w:proofErr w:type="spellEnd"/>
+            <w:r>
+              <w:t>Caffé affogato</w:t>
+            </w:r>
           </w:p>
         </w:tc>
         <w:tc>
@@ -2643,11 +2369,9 @@
             <w:pPr>
               <w:cnfStyle w:val="000000000000" w:firstRow="0" w:lastRow="0" w:firstColumn="0" w:lastColumn="0" w:oddVBand="0" w:evenVBand="0" w:oddHBand="0" w:evenHBand="0" w:firstRowFirstColumn="0" w:firstRowLastColumn="0" w:lastRowFirstColumn="0" w:lastRowLastColumn="0"/>
             </w:pPr>
-            <w:proofErr w:type="spellStart"/>
             <w:r>
               <w:t>Whip</w:t>
             </w:r>
-            <w:proofErr w:type="spellEnd"/>
           </w:p>
         </w:tc>
         <w:tc>
@@ -2658,11 +2382,9 @@
             <w:pPr>
               <w:cnfStyle w:val="000000000000" w:firstRow="0" w:lastRow="0" w:firstColumn="0" w:lastColumn="0" w:oddVBand="0" w:evenVBand="0" w:oddHBand="0" w:evenHBand="0" w:firstRowFirstColumn="0" w:firstRowLastColumn="0" w:lastRowFirstColumn="0" w:lastRowLastColumn="0"/>
             </w:pPr>
-            <w:proofErr w:type="spellStart"/>
             <w:r>
               <w:t>Whip</w:t>
             </w:r>
-            <w:proofErr w:type="spellEnd"/>
           </w:p>
         </w:tc>
         <w:tc>
@@ -2686,11 +2408,9 @@
             <w:tcW w:w="0" w:type="auto"/>
           </w:tcPr>
           <w:p>
-            <w:proofErr w:type="spellStart"/>
             <w:r>
               <w:t>Glace</w:t>
             </w:r>
-            <w:proofErr w:type="spellEnd"/>
           </w:p>
         </w:tc>
         <w:tc>
@@ -2758,13 +2478,8 @@
           </w:tcPr>
           <w:p>
             <w:r>
-              <w:t xml:space="preserve">Chocolate </w:t>
-            </w:r>
-            <w:proofErr w:type="spellStart"/>
-            <w:r>
-              <w:t>milk</w:t>
-            </w:r>
-            <w:proofErr w:type="spellEnd"/>
+              <w:t>Chocolate milk</w:t>
+            </w:r>
           </w:p>
         </w:tc>
         <w:tc>
@@ -2788,11 +2503,9 @@
             <w:pPr>
               <w:cnfStyle w:val="000000000000" w:firstRow="0" w:lastRow="0" w:firstColumn="0" w:lastColumn="0" w:oddVBand="0" w:evenVBand="0" w:oddHBand="0" w:evenHBand="0" w:firstRowFirstColumn="0" w:firstRowLastColumn="0" w:lastRowFirstColumn="0" w:lastRowLastColumn="0"/>
             </w:pPr>
-            <w:proofErr w:type="spellStart"/>
             <w:r>
               <w:t>Milk</w:t>
             </w:r>
-            <w:proofErr w:type="spellEnd"/>
           </w:p>
         </w:tc>
         <w:tc>
@@ -2803,11 +2516,9 @@
             <w:pPr>
               <w:cnfStyle w:val="000000000000" w:firstRow="0" w:lastRow="0" w:firstColumn="0" w:lastColumn="0" w:oddVBand="0" w:evenVBand="0" w:oddHBand="0" w:evenHBand="0" w:firstRowFirstColumn="0" w:firstRowLastColumn="0" w:lastRowFirstColumn="0" w:lastRowLastColumn="0"/>
             </w:pPr>
-            <w:proofErr w:type="spellStart"/>
             <w:r>
               <w:t>Milk</w:t>
             </w:r>
-            <w:proofErr w:type="spellEnd"/>
           </w:p>
         </w:tc>
         <w:tc>
@@ -2842,13 +2553,8 @@
           </w:tcPr>
           <w:p>
             <w:r>
-              <w:t xml:space="preserve">Demi – </w:t>
-            </w:r>
-            <w:proofErr w:type="spellStart"/>
-            <w:r>
-              <w:t>créme</w:t>
-            </w:r>
-            <w:proofErr w:type="spellEnd"/>
+              <w:t>Demi – créme</w:t>
+            </w:r>
           </w:p>
         </w:tc>
         <w:tc>
@@ -2898,11 +2604,9 @@
             <w:pPr>
               <w:cnfStyle w:val="000000100000" w:firstRow="0" w:lastRow="0" w:firstColumn="0" w:lastColumn="0" w:oddVBand="0" w:evenVBand="0" w:oddHBand="1" w:evenHBand="0" w:firstRowFirstColumn="0" w:firstRowLastColumn="0" w:lastRowFirstColumn="0" w:lastRowLastColumn="0"/>
             </w:pPr>
-            <w:proofErr w:type="gramStart"/>
             <w:r>
               <w:t>cream</w:t>
             </w:r>
-            <w:proofErr w:type="gramEnd"/>
           </w:p>
         </w:tc>
         <w:tc>
@@ -2924,13 +2628,8 @@
           </w:tcPr>
           <w:p>
             <w:r>
-              <w:t xml:space="preserve">Latte </w:t>
-            </w:r>
-            <w:proofErr w:type="spellStart"/>
-            <w:r>
-              <w:t>macchiato</w:t>
-            </w:r>
-            <w:proofErr w:type="spellEnd"/>
+              <w:t>Latte macchiato</w:t>
+            </w:r>
           </w:p>
         </w:tc>
         <w:tc>
@@ -2954,19 +2653,9 @@
             <w:pPr>
               <w:cnfStyle w:val="000000000000" w:firstRow="0" w:lastRow="0" w:firstColumn="0" w:lastColumn="0" w:oddVBand="0" w:evenVBand="0" w:oddHBand="0" w:evenHBand="0" w:firstRowFirstColumn="0" w:firstRowLastColumn="0" w:lastRowFirstColumn="0" w:lastRowLastColumn="0"/>
             </w:pPr>
-            <w:proofErr w:type="spellStart"/>
-            <w:r>
-              <w:t>Steamed</w:t>
-            </w:r>
-            <w:proofErr w:type="spellEnd"/>
-            <w:r>
-              <w:t xml:space="preserve"> </w:t>
-            </w:r>
-            <w:proofErr w:type="spellStart"/>
-            <w:r>
-              <w:t>Milk</w:t>
-            </w:r>
-            <w:proofErr w:type="spellEnd"/>
+            <w:r>
+              <w:t>Steamed Milk</w:t>
+            </w:r>
           </w:p>
         </w:tc>
         <w:tc>
@@ -2977,19 +2666,9 @@
             <w:pPr>
               <w:cnfStyle w:val="000000000000" w:firstRow="0" w:lastRow="0" w:firstColumn="0" w:lastColumn="0" w:oddVBand="0" w:evenVBand="0" w:oddHBand="0" w:evenHBand="0" w:firstRowFirstColumn="0" w:firstRowLastColumn="0" w:lastRowFirstColumn="0" w:lastRowLastColumn="0"/>
             </w:pPr>
-            <w:proofErr w:type="spellStart"/>
-            <w:r>
-              <w:t>Steamed</w:t>
-            </w:r>
-            <w:proofErr w:type="spellEnd"/>
-            <w:r>
-              <w:t xml:space="preserve"> </w:t>
-            </w:r>
-            <w:proofErr w:type="spellStart"/>
-            <w:r>
-              <w:t>Milk</w:t>
-            </w:r>
-            <w:proofErr w:type="spellEnd"/>
+            <w:r>
+              <w:t>Steamed Milk</w:t>
+            </w:r>
           </w:p>
         </w:tc>
         <w:tc>
@@ -3000,19 +2679,9 @@
             <w:pPr>
               <w:cnfStyle w:val="000000000000" w:firstRow="0" w:lastRow="0" w:firstColumn="0" w:lastColumn="0" w:oddVBand="0" w:evenVBand="0" w:oddHBand="0" w:evenHBand="0" w:firstRowFirstColumn="0" w:firstRowLastColumn="0" w:lastRowFirstColumn="0" w:lastRowLastColumn="0"/>
             </w:pPr>
-            <w:proofErr w:type="spellStart"/>
-            <w:r>
-              <w:t>Milk</w:t>
-            </w:r>
-            <w:proofErr w:type="spellEnd"/>
-            <w:r>
-              <w:t xml:space="preserve"> </w:t>
-            </w:r>
-            <w:proofErr w:type="spellStart"/>
-            <w:r>
-              <w:t>Foam</w:t>
-            </w:r>
-            <w:proofErr w:type="spellEnd"/>
+            <w:r>
+              <w:t>Milk Foam</w:t>
+            </w:r>
           </w:p>
         </w:tc>
         <w:tc>
@@ -3036,11 +2705,9 @@
             <w:tcW w:w="0" w:type="auto"/>
           </w:tcPr>
           <w:p>
-            <w:proofErr w:type="spellStart"/>
             <w:r>
               <w:t>Freddo</w:t>
             </w:r>
-            <w:proofErr w:type="spellEnd"/>
           </w:p>
         </w:tc>
         <w:tc>
@@ -3064,11 +2731,9 @@
             <w:pPr>
               <w:cnfStyle w:val="000000100000" w:firstRow="0" w:lastRow="0" w:firstColumn="0" w:lastColumn="0" w:oddVBand="0" w:evenVBand="0" w:oddHBand="1" w:evenHBand="0" w:firstRowFirstColumn="0" w:firstRowLastColumn="0" w:lastRowFirstColumn="0" w:lastRowLastColumn="0"/>
             </w:pPr>
-            <w:proofErr w:type="spellStart"/>
             <w:r>
               <w:t>Liqour</w:t>
             </w:r>
-            <w:proofErr w:type="spellEnd"/>
           </w:p>
         </w:tc>
         <w:tc>
@@ -3151,19 +2816,9 @@
             <w:pPr>
               <w:cnfStyle w:val="000000000000" w:firstRow="0" w:lastRow="0" w:firstColumn="0" w:lastColumn="0" w:oddVBand="0" w:evenVBand="0" w:oddHBand="0" w:evenHBand="0" w:firstRowFirstColumn="0" w:firstRowLastColumn="0" w:lastRowFirstColumn="0" w:lastRowLastColumn="0"/>
             </w:pPr>
-            <w:proofErr w:type="spellStart"/>
-            <w:r>
-              <w:t>Steamed</w:t>
-            </w:r>
-            <w:proofErr w:type="spellEnd"/>
-            <w:r>
-              <w:t xml:space="preserve"> </w:t>
-            </w:r>
-            <w:proofErr w:type="spellStart"/>
-            <w:r>
-              <w:t>Milk</w:t>
-            </w:r>
-            <w:proofErr w:type="spellEnd"/>
+            <w:r>
+              <w:t>Steamed Milk</w:t>
+            </w:r>
           </w:p>
         </w:tc>
         <w:tc>
@@ -3174,11 +2829,9 @@
             <w:pPr>
               <w:cnfStyle w:val="000000000000" w:firstRow="0" w:lastRow="0" w:firstColumn="0" w:lastColumn="0" w:oddVBand="0" w:evenVBand="0" w:oddHBand="0" w:evenHBand="0" w:firstRowFirstColumn="0" w:firstRowLastColumn="0" w:lastRowFirstColumn="0" w:lastRowLastColumn="0"/>
             </w:pPr>
-            <w:proofErr w:type="spellStart"/>
             <w:r>
               <w:t>Whip</w:t>
             </w:r>
-            <w:proofErr w:type="spellEnd"/>
           </w:p>
         </w:tc>
         <w:tc>
@@ -3202,13 +2855,8 @@
             <w:tcW w:w="0" w:type="auto"/>
           </w:tcPr>
           <w:p>
-            <w:proofErr w:type="spellStart"/>
-            <w:r>
-              <w:t>Caramel</w:t>
-            </w:r>
-            <w:proofErr w:type="spellEnd"/>
-            <w:r>
-              <w:t xml:space="preserve"> frappuccino</w:t>
+            <w:r>
+              <w:t>Caramel frappuccino</w:t>
             </w:r>
           </w:p>
         </w:tc>
@@ -3246,19 +2894,9 @@
             <w:pPr>
               <w:cnfStyle w:val="000000100000" w:firstRow="0" w:lastRow="0" w:firstColumn="0" w:lastColumn="0" w:oddVBand="0" w:evenVBand="0" w:oddHBand="1" w:evenHBand="0" w:firstRowFirstColumn="0" w:firstRowLastColumn="0" w:lastRowFirstColumn="0" w:lastRowLastColumn="0"/>
             </w:pPr>
-            <w:proofErr w:type="spellStart"/>
-            <w:r>
-              <w:t>Steamed</w:t>
-            </w:r>
-            <w:proofErr w:type="spellEnd"/>
-            <w:r>
-              <w:t xml:space="preserve"> </w:t>
-            </w:r>
-            <w:proofErr w:type="spellStart"/>
-            <w:r>
-              <w:t>Milk</w:t>
-            </w:r>
-            <w:proofErr w:type="spellEnd"/>
+            <w:r>
+              <w:t>Steamed Milk</w:t>
+            </w:r>
           </w:p>
         </w:tc>
         <w:tc>
@@ -3282,11 +2920,9 @@
             <w:pPr>
               <w:cnfStyle w:val="000000100000" w:firstRow="0" w:lastRow="0" w:firstColumn="0" w:lastColumn="0" w:oddVBand="0" w:evenVBand="0" w:oddHBand="1" w:evenHBand="0" w:firstRowFirstColumn="0" w:firstRowLastColumn="0" w:lastRowFirstColumn="0" w:lastRowLastColumn="0"/>
             </w:pPr>
-            <w:proofErr w:type="spellStart"/>
             <w:r>
               <w:t>Syrup</w:t>
             </w:r>
-            <w:proofErr w:type="spellEnd"/>
           </w:p>
         </w:tc>
       </w:tr>
@@ -3323,19 +2959,9 @@
             <w:pPr>
               <w:cnfStyle w:val="000000000000" w:firstRow="0" w:lastRow="0" w:firstColumn="0" w:lastColumn="0" w:oddVBand="0" w:evenVBand="0" w:oddHBand="0" w:evenHBand="0" w:firstRowFirstColumn="0" w:firstRowLastColumn="0" w:lastRowFirstColumn="0" w:lastRowLastColumn="0"/>
             </w:pPr>
-            <w:proofErr w:type="spellStart"/>
-            <w:r>
-              <w:t>Steamed</w:t>
-            </w:r>
-            <w:proofErr w:type="spellEnd"/>
-            <w:r>
-              <w:t xml:space="preserve"> </w:t>
-            </w:r>
-            <w:proofErr w:type="spellStart"/>
-            <w:r>
-              <w:t>Milk</w:t>
-            </w:r>
-            <w:proofErr w:type="spellEnd"/>
+            <w:r>
+              <w:t>Steamed Milk</w:t>
+            </w:r>
           </w:p>
         </w:tc>
         <w:tc>
@@ -3346,19 +2972,9 @@
             <w:pPr>
               <w:cnfStyle w:val="000000000000" w:firstRow="0" w:lastRow="0" w:firstColumn="0" w:lastColumn="0" w:oddVBand="0" w:evenVBand="0" w:oddHBand="0" w:evenHBand="0" w:firstRowFirstColumn="0" w:firstRowLastColumn="0" w:lastRowFirstColumn="0" w:lastRowLastColumn="0"/>
             </w:pPr>
-            <w:proofErr w:type="spellStart"/>
-            <w:r>
-              <w:t>Steamed</w:t>
-            </w:r>
-            <w:proofErr w:type="spellEnd"/>
-            <w:r>
-              <w:t xml:space="preserve"> </w:t>
-            </w:r>
-            <w:proofErr w:type="spellStart"/>
-            <w:r>
-              <w:t>Milk</w:t>
-            </w:r>
-            <w:proofErr w:type="spellEnd"/>
+            <w:r>
+              <w:t>Steamed Milk</w:t>
+            </w:r>
           </w:p>
         </w:tc>
         <w:tc>
@@ -3434,11 +3050,9 @@
             <w:pPr>
               <w:cnfStyle w:val="000000100000" w:firstRow="0" w:lastRow="0" w:firstColumn="0" w:lastColumn="0" w:oddVBand="0" w:evenVBand="0" w:oddHBand="1" w:evenHBand="0" w:firstRowFirstColumn="0" w:firstRowLastColumn="0" w:lastRowFirstColumn="0" w:lastRowLastColumn="0"/>
             </w:pPr>
-            <w:proofErr w:type="spellStart"/>
             <w:r>
               <w:t>Whiskey</w:t>
             </w:r>
-            <w:proofErr w:type="spellEnd"/>
           </w:p>
         </w:tc>
         <w:tc>
@@ -3449,11 +3063,9 @@
             <w:pPr>
               <w:cnfStyle w:val="000000100000" w:firstRow="0" w:lastRow="0" w:firstColumn="0" w:lastColumn="0" w:oddVBand="0" w:evenVBand="0" w:oddHBand="1" w:evenHBand="0" w:firstRowFirstColumn="0" w:firstRowLastColumn="0" w:lastRowFirstColumn="0" w:lastRowLastColumn="0"/>
             </w:pPr>
-            <w:proofErr w:type="spellStart"/>
             <w:r>
               <w:t>Whip</w:t>
             </w:r>
-            <w:proofErr w:type="spellEnd"/>
           </w:p>
         </w:tc>
         <w:tc>
@@ -3490,7 +3102,7 @@
       <w:pPr>
         <w:pStyle w:val="Kop1"/>
       </w:pPr>
-      <w:bookmarkStart w:id="2" w:name="_Toc144047733"/>
+      <w:bookmarkStart w:id="2" w:name="_Toc242184845"/>
       <w:r>
         <w:lastRenderedPageBreak/>
         <w:t xml:space="preserve">Opdracht #3 – </w:t>
@@ -3501,87 +3113,1472 @@
       <w:bookmarkEnd w:id="2"/>
     </w:p>
     <w:p>
+      <w:pPr>
+        <w:rPr>
+          <w:sz w:val="28"/>
+          <w:szCs w:val="28"/>
+        </w:rPr>
+      </w:pPr>
       <w:r>
-        <w:t xml:space="preserve">De klant wil nu ook dat het mogelijk is om in verschillende maten te bestellen. Hiervoor is de property </w:t>
-      </w:r>
-      <w:proofErr w:type="spellStart"/>
-      <w:r>
-        <w:t>Size</w:t>
-      </w:r>
-      <w:proofErr w:type="spellEnd"/>
-      <w:r>
-        <w:t xml:space="preserve"> al toegevoegd</w:t>
+        <w:rPr>
+          <w:sz w:val="28"/>
+          <w:szCs w:val="28"/>
+        </w:rPr>
+        <w:t>De klant wil nu ook dat het mogelijk is om in verschillende maten te bestellen. Hiervoor is de property Size al toegevoegd</w:t>
       </w:r>
       <w:r>
-        <w:t xml:space="preserve"> aan de </w:t>
-      </w:r>
-      <w:proofErr w:type="spellStart"/>
-      <w:r>
-        <w:t>Beverage</w:t>
-      </w:r>
-      <w:proofErr w:type="spellEnd"/>
-      <w:r>
-        <w:t xml:space="preserve"> Class. De prijzen</w:t>
+        <w:rPr>
+          <w:sz w:val="28"/>
+          <w:szCs w:val="28"/>
+        </w:rPr>
+        <w:t xml:space="preserve"> aan de Beverage Class. De prijzen</w:t>
       </w:r>
       <w:r>
-        <w:t xml:space="preserve"> van de </w:t>
-      </w:r>
-      <w:proofErr w:type="spellStart"/>
-      <w:r>
-        <w:t>condiments</w:t>
-      </w:r>
-      <w:proofErr w:type="spellEnd"/>
-      <w:r>
-        <w:t xml:space="preserve"> moeten afhankelijk van de maat worden verhoogd. Bijvoorbeeld: </w:t>
-      </w:r>
-      <w:proofErr w:type="spellStart"/>
-      <w:r>
-        <w:t>Whip</w:t>
-      </w:r>
-      <w:proofErr w:type="spellEnd"/>
-      <w:r>
-        <w:t xml:space="preserve"> kost </w:t>
-      </w:r>
-      <w:r>
-        <w:t>€</w:t>
-      </w:r>
-      <w:r>
-        <w:t xml:space="preserve">0,10, </w:t>
-      </w:r>
-      <w:r>
-        <w:t>€</w:t>
-      </w:r>
-      <w:r>
-        <w:t xml:space="preserve">0,15 en </w:t>
-      </w:r>
-      <w:r>
-        <w:t>€</w:t>
-      </w:r>
-      <w:r>
-        <w:t xml:space="preserve">0,20 meer voor </w:t>
-      </w:r>
-      <w:proofErr w:type="spellStart"/>
-      <w:r>
-        <w:t>tall</w:t>
-      </w:r>
-      <w:proofErr w:type="spellEnd"/>
-      <w:r>
-        <w:t xml:space="preserve">, grande en </w:t>
-      </w:r>
-      <w:proofErr w:type="spellStart"/>
-      <w:r>
-        <w:t>vendi</w:t>
-      </w:r>
-      <w:proofErr w:type="spellEnd"/>
-      <w:r>
-        <w:t xml:space="preserve"> koffie.</w:t>
+        <w:rPr>
+          <w:sz w:val="28"/>
+          <w:szCs w:val="28"/>
+        </w:rPr>
+        <w:t xml:space="preserve"> van de condiments moeten afhankelijk van de maat worden verhoogd. </w:t>
       </w:r>
     </w:p>
+    <w:tbl>
+      <w:tblPr>
+        <w:tblStyle w:val="Rastertabel5donker-Accent3"/>
+        <w:tblW w:w="5000" w:type="pct"/>
+        <w:tblLook w:val="04A0" w:firstRow="1" w:lastRow="0" w:firstColumn="1" w:lastColumn="0" w:noHBand="0" w:noVBand="1"/>
+      </w:tblPr>
+      <w:tblGrid>
+        <w:gridCol w:w="2407"/>
+        <w:gridCol w:w="2407"/>
+        <w:gridCol w:w="2407"/>
+        <w:gridCol w:w="2407"/>
+      </w:tblGrid>
+      <w:tr>
+        <w:trPr>
+          <w:cnfStyle w:val="100000000000" w:firstRow="1" w:lastRow="0" w:firstColumn="0" w:lastColumn="0" w:oddVBand="0" w:evenVBand="0" w:oddHBand="0" w:evenHBand="0" w:firstRowFirstColumn="0" w:firstRowLastColumn="0" w:lastRowFirstColumn="0" w:lastRowLastColumn="0"/>
+        </w:trPr>
+        <w:tc>
+          <w:tcPr>
+            <w:cnfStyle w:val="001000000000" w:firstRow="0" w:lastRow="0" w:firstColumn="1" w:lastColumn="0" w:oddVBand="0" w:evenVBand="0" w:oddHBand="0" w:evenHBand="0" w:firstRowFirstColumn="0" w:firstRowLastColumn="0" w:lastRowFirstColumn="0" w:lastRowLastColumn="0"/>
+            <w:tcW w:w="1250" w:type="pct"/>
+            <w:tcBorders>
+              <w:right w:val="single" w:sz="4" w:space="0" w:color="000000" w:themeColor="text1"/>
+            </w:tcBorders>
+          </w:tcPr>
+          <w:p>
+            <w:r>
+              <w:t>Condiments</w:t>
+            </w:r>
+          </w:p>
+        </w:tc>
+        <w:tc>
+          <w:tcPr>
+            <w:tcW w:w="1250" w:type="pct"/>
+            <w:tcBorders>
+              <w:left w:val="single" w:sz="4" w:space="0" w:color="000000" w:themeColor="text1"/>
+              <w:right w:val="single" w:sz="4" w:space="0" w:color="000000" w:themeColor="text1"/>
+            </w:tcBorders>
+          </w:tcPr>
+          <w:p>
+            <w:pPr>
+              <w:cnfStyle w:val="100000000000" w:firstRow="1" w:lastRow="0" w:firstColumn="0" w:lastColumn="0" w:oddVBand="0" w:evenVBand="0" w:oddHBand="0" w:evenHBand="0" w:firstRowFirstColumn="0" w:firstRowLastColumn="0" w:lastRowFirstColumn="0" w:lastRowLastColumn="0"/>
+            </w:pPr>
+            <w:r>
+              <w:t>Tall</w:t>
+            </w:r>
+          </w:p>
+        </w:tc>
+        <w:tc>
+          <w:tcPr>
+            <w:tcW w:w="1250" w:type="pct"/>
+            <w:tcBorders>
+              <w:left w:val="single" w:sz="4" w:space="0" w:color="000000" w:themeColor="text1"/>
+              <w:right w:val="single" w:sz="4" w:space="0" w:color="000000" w:themeColor="text1"/>
+            </w:tcBorders>
+          </w:tcPr>
+          <w:p>
+            <w:pPr>
+              <w:cnfStyle w:val="100000000000" w:firstRow="1" w:lastRow="0" w:firstColumn="0" w:lastColumn="0" w:oddVBand="0" w:evenVBand="0" w:oddHBand="0" w:evenHBand="0" w:firstRowFirstColumn="0" w:firstRowLastColumn="0" w:lastRowFirstColumn="0" w:lastRowLastColumn="0"/>
+            </w:pPr>
+            <w:r>
+              <w:t>Grande</w:t>
+            </w:r>
+          </w:p>
+        </w:tc>
+        <w:tc>
+          <w:tcPr>
+            <w:tcW w:w="1250" w:type="pct"/>
+            <w:tcBorders>
+              <w:left w:val="single" w:sz="4" w:space="0" w:color="000000" w:themeColor="text1"/>
+            </w:tcBorders>
+          </w:tcPr>
+          <w:p>
+            <w:pPr>
+              <w:cnfStyle w:val="100000000000" w:firstRow="1" w:lastRow="0" w:firstColumn="0" w:lastColumn="0" w:oddVBand="0" w:evenVBand="0" w:oddHBand="0" w:evenHBand="0" w:firstRowFirstColumn="0" w:firstRowLastColumn="0" w:lastRowFirstColumn="0" w:lastRowLastColumn="0"/>
+            </w:pPr>
+            <w:r>
+              <w:t>Venti</w:t>
+            </w:r>
+          </w:p>
+        </w:tc>
+      </w:tr>
+      <w:tr>
+        <w:trPr>
+          <w:cnfStyle w:val="000000100000" w:firstRow="0" w:lastRow="0" w:firstColumn="0" w:lastColumn="0" w:oddVBand="0" w:evenVBand="0" w:oddHBand="1" w:evenHBand="0" w:firstRowFirstColumn="0" w:firstRowLastColumn="0" w:lastRowFirstColumn="0" w:lastRowLastColumn="0"/>
+        </w:trPr>
+        <w:tc>
+          <w:tcPr>
+            <w:cnfStyle w:val="001000000000" w:firstRow="0" w:lastRow="0" w:firstColumn="1" w:lastColumn="0" w:oddVBand="0" w:evenVBand="0" w:oddHBand="0" w:evenHBand="0" w:firstRowFirstColumn="0" w:firstRowLastColumn="0" w:lastRowFirstColumn="0" w:lastRowLastColumn="0"/>
+            <w:tcW w:w="1250" w:type="pct"/>
+            <w:tcBorders>
+              <w:bottom w:val="single" w:sz="4" w:space="0" w:color="000000" w:themeColor="text1"/>
+              <w:right w:val="single" w:sz="4" w:space="0" w:color="000000" w:themeColor="text1"/>
+            </w:tcBorders>
+          </w:tcPr>
+          <w:p>
+            <w:r>
+              <w:t>Espresso</w:t>
+            </w:r>
+          </w:p>
+        </w:tc>
+        <w:tc>
+          <w:tcPr>
+            <w:tcW w:w="1250" w:type="pct"/>
+            <w:tcBorders>
+              <w:left w:val="single" w:sz="4" w:space="0" w:color="000000" w:themeColor="text1"/>
+              <w:bottom w:val="single" w:sz="4" w:space="0" w:color="000000" w:themeColor="text1"/>
+              <w:right w:val="single" w:sz="4" w:space="0" w:color="000000" w:themeColor="text1"/>
+            </w:tcBorders>
+          </w:tcPr>
+          <w:p>
+            <w:pPr>
+              <w:cnfStyle w:val="000000100000" w:firstRow="0" w:lastRow="0" w:firstColumn="0" w:lastColumn="0" w:oddVBand="0" w:evenVBand="0" w:oddHBand="1" w:evenHBand="0" w:firstRowFirstColumn="0" w:firstRowLastColumn="0" w:lastRowFirstColumn="0" w:lastRowLastColumn="0"/>
+            </w:pPr>
+            <w:r>
+              <w:t>1,99</w:t>
+            </w:r>
+          </w:p>
+        </w:tc>
+        <w:tc>
+          <w:tcPr>
+            <w:tcW w:w="1250" w:type="pct"/>
+            <w:tcBorders>
+              <w:left w:val="single" w:sz="4" w:space="0" w:color="000000" w:themeColor="text1"/>
+              <w:bottom w:val="single" w:sz="4" w:space="0" w:color="000000" w:themeColor="text1"/>
+              <w:right w:val="single" w:sz="4" w:space="0" w:color="000000" w:themeColor="text1"/>
+            </w:tcBorders>
+          </w:tcPr>
+          <w:p>
+            <w:pPr>
+              <w:cnfStyle w:val="000000100000" w:firstRow="0" w:lastRow="0" w:firstColumn="0" w:lastColumn="0" w:oddVBand="0" w:evenVBand="0" w:oddHBand="1" w:evenHBand="0" w:firstRowFirstColumn="0" w:firstRowLastColumn="0" w:lastRowFirstColumn="0" w:lastRowLastColumn="0"/>
+            </w:pPr>
+            <w:r>
+              <w:t>2,29</w:t>
+            </w:r>
+          </w:p>
+        </w:tc>
+        <w:tc>
+          <w:tcPr>
+            <w:tcW w:w="1250" w:type="pct"/>
+            <w:tcBorders>
+              <w:left w:val="single" w:sz="4" w:space="0" w:color="000000" w:themeColor="text1"/>
+              <w:bottom w:val="single" w:sz="4" w:space="0" w:color="000000" w:themeColor="text1"/>
+            </w:tcBorders>
+          </w:tcPr>
+          <w:p>
+            <w:pPr>
+              <w:cnfStyle w:val="000000100000" w:firstRow="0" w:lastRow="0" w:firstColumn="0" w:lastColumn="0" w:oddVBand="0" w:evenVBand="0" w:oddHBand="1" w:evenHBand="0" w:firstRowFirstColumn="0" w:firstRowLastColumn="0" w:lastRowFirstColumn="0" w:lastRowLastColumn="0"/>
+            </w:pPr>
+            <w:r>
+              <w:t>2,69</w:t>
+            </w:r>
+          </w:p>
+        </w:tc>
+      </w:tr>
+      <w:tr>
+        <w:tc>
+          <w:tcPr>
+            <w:cnfStyle w:val="001000000000" w:firstRow="0" w:lastRow="0" w:firstColumn="1" w:lastColumn="0" w:oddVBand="0" w:evenVBand="0" w:oddHBand="0" w:evenHBand="0" w:firstRowFirstColumn="0" w:firstRowLastColumn="0" w:lastRowFirstColumn="0" w:lastRowLastColumn="0"/>
+            <w:tcW w:w="1250" w:type="pct"/>
+            <w:tcBorders>
+              <w:top w:val="single" w:sz="4" w:space="0" w:color="000000" w:themeColor="text1"/>
+              <w:bottom w:val="single" w:sz="4" w:space="0" w:color="000000" w:themeColor="text1"/>
+              <w:right w:val="single" w:sz="4" w:space="0" w:color="000000" w:themeColor="text1"/>
+            </w:tcBorders>
+          </w:tcPr>
+          <w:p>
+            <w:r>
+              <w:t>Water</w:t>
+            </w:r>
+          </w:p>
+        </w:tc>
+        <w:tc>
+          <w:tcPr>
+            <w:tcW w:w="1250" w:type="pct"/>
+            <w:tcBorders>
+              <w:top w:val="single" w:sz="4" w:space="0" w:color="000000" w:themeColor="text1"/>
+              <w:left w:val="single" w:sz="4" w:space="0" w:color="000000" w:themeColor="text1"/>
+              <w:bottom w:val="single" w:sz="4" w:space="0" w:color="000000" w:themeColor="text1"/>
+              <w:right w:val="single" w:sz="4" w:space="0" w:color="000000" w:themeColor="text1"/>
+            </w:tcBorders>
+          </w:tcPr>
+          <w:p>
+            <w:pPr>
+              <w:cnfStyle w:val="000000000000" w:firstRow="0" w:lastRow="0" w:firstColumn="0" w:lastColumn="0" w:oddVBand="0" w:evenVBand="0" w:oddHBand="0" w:evenHBand="0" w:firstRowFirstColumn="0" w:firstRowLastColumn="0" w:lastRowFirstColumn="0" w:lastRowLastColumn="0"/>
+            </w:pPr>
+            <w:r>
+              <w:t>0,50</w:t>
+            </w:r>
+          </w:p>
+        </w:tc>
+        <w:tc>
+          <w:tcPr>
+            <w:tcW w:w="1250" w:type="pct"/>
+            <w:tcBorders>
+              <w:top w:val="single" w:sz="4" w:space="0" w:color="000000" w:themeColor="text1"/>
+              <w:left w:val="single" w:sz="4" w:space="0" w:color="000000" w:themeColor="text1"/>
+              <w:bottom w:val="single" w:sz="4" w:space="0" w:color="000000" w:themeColor="text1"/>
+              <w:right w:val="single" w:sz="4" w:space="0" w:color="000000" w:themeColor="text1"/>
+            </w:tcBorders>
+          </w:tcPr>
+          <w:p>
+            <w:pPr>
+              <w:cnfStyle w:val="000000000000" w:firstRow="0" w:lastRow="0" w:firstColumn="0" w:lastColumn="0" w:oddVBand="0" w:evenVBand="0" w:oddHBand="0" w:evenHBand="0" w:firstRowFirstColumn="0" w:firstRowLastColumn="0" w:lastRowFirstColumn="0" w:lastRowLastColumn="0"/>
+            </w:pPr>
+            <w:r>
+              <w:t>0,55</w:t>
+            </w:r>
+          </w:p>
+        </w:tc>
+        <w:tc>
+          <w:tcPr>
+            <w:tcW w:w="1250" w:type="pct"/>
+            <w:tcBorders>
+              <w:top w:val="single" w:sz="4" w:space="0" w:color="000000" w:themeColor="text1"/>
+              <w:left w:val="single" w:sz="4" w:space="0" w:color="000000" w:themeColor="text1"/>
+              <w:bottom w:val="single" w:sz="4" w:space="0" w:color="000000" w:themeColor="text1"/>
+            </w:tcBorders>
+          </w:tcPr>
+          <w:p>
+            <w:pPr>
+              <w:cnfStyle w:val="000000000000" w:firstRow="0" w:lastRow="0" w:firstColumn="0" w:lastColumn="0" w:oddVBand="0" w:evenVBand="0" w:oddHBand="0" w:evenHBand="0" w:firstRowFirstColumn="0" w:firstRowLastColumn="0" w:lastRowFirstColumn="0" w:lastRowLastColumn="0"/>
+            </w:pPr>
+            <w:r>
+              <w:t>0,50</w:t>
+            </w:r>
+          </w:p>
+        </w:tc>
+      </w:tr>
+      <w:tr>
+        <w:trPr>
+          <w:cnfStyle w:val="000000100000" w:firstRow="0" w:lastRow="0" w:firstColumn="0" w:lastColumn="0" w:oddVBand="0" w:evenVBand="0" w:oddHBand="1" w:evenHBand="0" w:firstRowFirstColumn="0" w:firstRowLastColumn="0" w:lastRowFirstColumn="0" w:lastRowLastColumn="0"/>
+        </w:trPr>
+        <w:tc>
+          <w:tcPr>
+            <w:cnfStyle w:val="001000000000" w:firstRow="0" w:lastRow="0" w:firstColumn="1" w:lastColumn="0" w:oddVBand="0" w:evenVBand="0" w:oddHBand="0" w:evenHBand="0" w:firstRowFirstColumn="0" w:firstRowLastColumn="0" w:lastRowFirstColumn="0" w:lastRowLastColumn="0"/>
+            <w:tcW w:w="1250" w:type="pct"/>
+            <w:tcBorders>
+              <w:top w:val="single" w:sz="4" w:space="0" w:color="000000" w:themeColor="text1"/>
+              <w:bottom w:val="single" w:sz="4" w:space="0" w:color="000000" w:themeColor="text1"/>
+              <w:right w:val="single" w:sz="4" w:space="0" w:color="000000" w:themeColor="text1"/>
+            </w:tcBorders>
+          </w:tcPr>
+          <w:p>
+            <w:r>
+              <w:t>Milk Foam</w:t>
+            </w:r>
+          </w:p>
+        </w:tc>
+        <w:tc>
+          <w:tcPr>
+            <w:tcW w:w="1250" w:type="pct"/>
+            <w:tcBorders>
+              <w:top w:val="single" w:sz="4" w:space="0" w:color="000000" w:themeColor="text1"/>
+              <w:left w:val="single" w:sz="4" w:space="0" w:color="000000" w:themeColor="text1"/>
+              <w:bottom w:val="single" w:sz="4" w:space="0" w:color="000000" w:themeColor="text1"/>
+              <w:right w:val="single" w:sz="4" w:space="0" w:color="000000" w:themeColor="text1"/>
+            </w:tcBorders>
+          </w:tcPr>
+          <w:p>
+            <w:pPr>
+              <w:cnfStyle w:val="000000100000" w:firstRow="0" w:lastRow="0" w:firstColumn="0" w:lastColumn="0" w:oddVBand="0" w:evenVBand="0" w:oddHBand="1" w:evenHBand="0" w:firstRowFirstColumn="0" w:firstRowLastColumn="0" w:lastRowFirstColumn="0" w:lastRowLastColumn="0"/>
+            </w:pPr>
+            <w:r>
+              <w:t>0,12</w:t>
+            </w:r>
+          </w:p>
+        </w:tc>
+        <w:tc>
+          <w:tcPr>
+            <w:tcW w:w="1250" w:type="pct"/>
+            <w:tcBorders>
+              <w:top w:val="single" w:sz="4" w:space="0" w:color="000000" w:themeColor="text1"/>
+              <w:left w:val="single" w:sz="4" w:space="0" w:color="000000" w:themeColor="text1"/>
+              <w:bottom w:val="single" w:sz="4" w:space="0" w:color="000000" w:themeColor="text1"/>
+              <w:right w:val="single" w:sz="4" w:space="0" w:color="000000" w:themeColor="text1"/>
+            </w:tcBorders>
+          </w:tcPr>
+          <w:p>
+            <w:pPr>
+              <w:cnfStyle w:val="000000100000" w:firstRow="0" w:lastRow="0" w:firstColumn="0" w:lastColumn="0" w:oddVBand="0" w:evenVBand="0" w:oddHBand="1" w:evenHBand="0" w:firstRowFirstColumn="0" w:firstRowLastColumn="0" w:lastRowFirstColumn="0" w:lastRowLastColumn="0"/>
+            </w:pPr>
+            <w:r>
+              <w:t>0,14</w:t>
+            </w:r>
+          </w:p>
+        </w:tc>
+        <w:tc>
+          <w:tcPr>
+            <w:tcW w:w="1250" w:type="pct"/>
+            <w:tcBorders>
+              <w:top w:val="single" w:sz="4" w:space="0" w:color="000000" w:themeColor="text1"/>
+              <w:left w:val="single" w:sz="4" w:space="0" w:color="000000" w:themeColor="text1"/>
+              <w:bottom w:val="single" w:sz="4" w:space="0" w:color="000000" w:themeColor="text1"/>
+            </w:tcBorders>
+          </w:tcPr>
+          <w:p>
+            <w:pPr>
+              <w:cnfStyle w:val="000000100000" w:firstRow="0" w:lastRow="0" w:firstColumn="0" w:lastColumn="0" w:oddVBand="0" w:evenVBand="0" w:oddHBand="1" w:evenHBand="0" w:firstRowFirstColumn="0" w:firstRowLastColumn="0" w:lastRowFirstColumn="0" w:lastRowLastColumn="0"/>
+            </w:pPr>
+            <w:r>
+              <w:t>0,17</w:t>
+            </w:r>
+          </w:p>
+        </w:tc>
+      </w:tr>
+      <w:tr>
+        <w:tc>
+          <w:tcPr>
+            <w:cnfStyle w:val="001000000000" w:firstRow="0" w:lastRow="0" w:firstColumn="1" w:lastColumn="0" w:oddVBand="0" w:evenVBand="0" w:oddHBand="0" w:evenHBand="0" w:firstRowFirstColumn="0" w:firstRowLastColumn="0" w:lastRowFirstColumn="0" w:lastRowLastColumn="0"/>
+            <w:tcW w:w="1250" w:type="pct"/>
+            <w:tcBorders>
+              <w:top w:val="single" w:sz="4" w:space="0" w:color="000000" w:themeColor="text1"/>
+              <w:bottom w:val="single" w:sz="4" w:space="0" w:color="000000" w:themeColor="text1"/>
+              <w:right w:val="single" w:sz="4" w:space="0" w:color="000000" w:themeColor="text1"/>
+            </w:tcBorders>
+          </w:tcPr>
+          <w:p>
+            <w:r>
+              <w:t>Liqour</w:t>
+            </w:r>
+          </w:p>
+        </w:tc>
+        <w:tc>
+          <w:tcPr>
+            <w:tcW w:w="1250" w:type="pct"/>
+            <w:tcBorders>
+              <w:top w:val="single" w:sz="4" w:space="0" w:color="000000" w:themeColor="text1"/>
+              <w:left w:val="single" w:sz="4" w:space="0" w:color="000000" w:themeColor="text1"/>
+              <w:bottom w:val="single" w:sz="4" w:space="0" w:color="000000" w:themeColor="text1"/>
+              <w:right w:val="single" w:sz="4" w:space="0" w:color="000000" w:themeColor="text1"/>
+            </w:tcBorders>
+          </w:tcPr>
+          <w:p>
+            <w:pPr>
+              <w:cnfStyle w:val="000000000000" w:firstRow="0" w:lastRow="0" w:firstColumn="0" w:lastColumn="0" w:oddVBand="0" w:evenVBand="0" w:oddHBand="0" w:evenHBand="0" w:firstRowFirstColumn="0" w:firstRowLastColumn="0" w:lastRowFirstColumn="0" w:lastRowLastColumn="0"/>
+            </w:pPr>
+            <w:r>
+              <w:t>1,39</w:t>
+            </w:r>
+          </w:p>
+        </w:tc>
+        <w:tc>
+          <w:tcPr>
+            <w:tcW w:w="1250" w:type="pct"/>
+            <w:tcBorders>
+              <w:top w:val="single" w:sz="4" w:space="0" w:color="000000" w:themeColor="text1"/>
+              <w:left w:val="single" w:sz="4" w:space="0" w:color="000000" w:themeColor="text1"/>
+              <w:bottom w:val="single" w:sz="4" w:space="0" w:color="000000" w:themeColor="text1"/>
+              <w:right w:val="single" w:sz="4" w:space="0" w:color="000000" w:themeColor="text1"/>
+            </w:tcBorders>
+          </w:tcPr>
+          <w:p>
+            <w:pPr>
+              <w:cnfStyle w:val="000000000000" w:firstRow="0" w:lastRow="0" w:firstColumn="0" w:lastColumn="0" w:oddVBand="0" w:evenVBand="0" w:oddHBand="0" w:evenHBand="0" w:firstRowFirstColumn="0" w:firstRowLastColumn="0" w:lastRowFirstColumn="0" w:lastRowLastColumn="0"/>
+            </w:pPr>
+            <w:r>
+              <w:t>1,69</w:t>
+            </w:r>
+          </w:p>
+        </w:tc>
+        <w:tc>
+          <w:tcPr>
+            <w:tcW w:w="1250" w:type="pct"/>
+            <w:tcBorders>
+              <w:top w:val="single" w:sz="4" w:space="0" w:color="000000" w:themeColor="text1"/>
+              <w:left w:val="single" w:sz="4" w:space="0" w:color="000000" w:themeColor="text1"/>
+              <w:bottom w:val="single" w:sz="4" w:space="0" w:color="000000" w:themeColor="text1"/>
+            </w:tcBorders>
+          </w:tcPr>
+          <w:p>
+            <w:pPr>
+              <w:cnfStyle w:val="000000000000" w:firstRow="0" w:lastRow="0" w:firstColumn="0" w:lastColumn="0" w:oddVBand="0" w:evenVBand="0" w:oddHBand="0" w:evenHBand="0" w:firstRowFirstColumn="0" w:firstRowLastColumn="0" w:lastRowFirstColumn="0" w:lastRowLastColumn="0"/>
+            </w:pPr>
+            <w:r>
+              <w:t>1,99</w:t>
+            </w:r>
+          </w:p>
+        </w:tc>
+      </w:tr>
+      <w:tr>
+        <w:trPr>
+          <w:cnfStyle w:val="000000100000" w:firstRow="0" w:lastRow="0" w:firstColumn="0" w:lastColumn="0" w:oddVBand="0" w:evenVBand="0" w:oddHBand="1" w:evenHBand="0" w:firstRowFirstColumn="0" w:firstRowLastColumn="0" w:lastRowFirstColumn="0" w:lastRowLastColumn="0"/>
+        </w:trPr>
+        <w:tc>
+          <w:tcPr>
+            <w:cnfStyle w:val="001000000000" w:firstRow="0" w:lastRow="0" w:firstColumn="1" w:lastColumn="0" w:oddVBand="0" w:evenVBand="0" w:oddHBand="0" w:evenHBand="0" w:firstRowFirstColumn="0" w:firstRowLastColumn="0" w:lastRowFirstColumn="0" w:lastRowLastColumn="0"/>
+            <w:tcW w:w="1250" w:type="pct"/>
+            <w:tcBorders>
+              <w:top w:val="single" w:sz="4" w:space="0" w:color="000000" w:themeColor="text1"/>
+              <w:bottom w:val="single" w:sz="4" w:space="0" w:color="000000" w:themeColor="text1"/>
+              <w:right w:val="single" w:sz="4" w:space="0" w:color="000000" w:themeColor="text1"/>
+            </w:tcBorders>
+          </w:tcPr>
+          <w:p>
+            <w:r>
+              <w:t>Whip</w:t>
+            </w:r>
+          </w:p>
+        </w:tc>
+        <w:tc>
+          <w:tcPr>
+            <w:tcW w:w="1250" w:type="pct"/>
+            <w:tcBorders>
+              <w:top w:val="single" w:sz="4" w:space="0" w:color="000000" w:themeColor="text1"/>
+              <w:left w:val="single" w:sz="4" w:space="0" w:color="000000" w:themeColor="text1"/>
+              <w:bottom w:val="single" w:sz="4" w:space="0" w:color="000000" w:themeColor="text1"/>
+              <w:right w:val="single" w:sz="4" w:space="0" w:color="000000" w:themeColor="text1"/>
+            </w:tcBorders>
+          </w:tcPr>
+          <w:p>
+            <w:pPr>
+              <w:cnfStyle w:val="000000100000" w:firstRow="0" w:lastRow="0" w:firstColumn="0" w:lastColumn="0" w:oddVBand="0" w:evenVBand="0" w:oddHBand="1" w:evenHBand="0" w:firstRowFirstColumn="0" w:firstRowLastColumn="0" w:lastRowFirstColumn="0" w:lastRowLastColumn="0"/>
+            </w:pPr>
+            <w:r>
+              <w:t>0,39</w:t>
+            </w:r>
+          </w:p>
+        </w:tc>
+        <w:tc>
+          <w:tcPr>
+            <w:tcW w:w="1250" w:type="pct"/>
+            <w:tcBorders>
+              <w:top w:val="single" w:sz="4" w:space="0" w:color="000000" w:themeColor="text1"/>
+              <w:left w:val="single" w:sz="4" w:space="0" w:color="000000" w:themeColor="text1"/>
+              <w:bottom w:val="single" w:sz="4" w:space="0" w:color="000000" w:themeColor="text1"/>
+              <w:right w:val="single" w:sz="4" w:space="0" w:color="000000" w:themeColor="text1"/>
+            </w:tcBorders>
+          </w:tcPr>
+          <w:p>
+            <w:pPr>
+              <w:cnfStyle w:val="000000100000" w:firstRow="0" w:lastRow="0" w:firstColumn="0" w:lastColumn="0" w:oddVBand="0" w:evenVBand="0" w:oddHBand="1" w:evenHBand="0" w:firstRowFirstColumn="0" w:firstRowLastColumn="0" w:lastRowFirstColumn="0" w:lastRowLastColumn="0"/>
+            </w:pPr>
+            <w:r>
+              <w:t>0,42</w:t>
+            </w:r>
+          </w:p>
+        </w:tc>
+        <w:tc>
+          <w:tcPr>
+            <w:tcW w:w="1250" w:type="pct"/>
+            <w:tcBorders>
+              <w:top w:val="single" w:sz="4" w:space="0" w:color="000000" w:themeColor="text1"/>
+              <w:left w:val="single" w:sz="4" w:space="0" w:color="000000" w:themeColor="text1"/>
+              <w:bottom w:val="single" w:sz="4" w:space="0" w:color="000000" w:themeColor="text1"/>
+            </w:tcBorders>
+          </w:tcPr>
+          <w:p>
+            <w:pPr>
+              <w:cnfStyle w:val="000000100000" w:firstRow="0" w:lastRow="0" w:firstColumn="0" w:lastColumn="0" w:oddVBand="0" w:evenVBand="0" w:oddHBand="1" w:evenHBand="0" w:firstRowFirstColumn="0" w:firstRowLastColumn="0" w:lastRowFirstColumn="0" w:lastRowLastColumn="0"/>
+            </w:pPr>
+            <w:r>
+              <w:t>0,46</w:t>
+            </w:r>
+          </w:p>
+        </w:tc>
+      </w:tr>
+      <w:tr>
+        <w:tc>
+          <w:tcPr>
+            <w:cnfStyle w:val="001000000000" w:firstRow="0" w:lastRow="0" w:firstColumn="1" w:lastColumn="0" w:oddVBand="0" w:evenVBand="0" w:oddHBand="0" w:evenHBand="0" w:firstRowFirstColumn="0" w:firstRowLastColumn="0" w:lastRowFirstColumn="0" w:lastRowLastColumn="0"/>
+            <w:tcW w:w="1250" w:type="pct"/>
+            <w:tcBorders>
+              <w:top w:val="single" w:sz="4" w:space="0" w:color="000000" w:themeColor="text1"/>
+              <w:bottom w:val="single" w:sz="4" w:space="0" w:color="000000" w:themeColor="text1"/>
+              <w:right w:val="single" w:sz="4" w:space="0" w:color="000000" w:themeColor="text1"/>
+            </w:tcBorders>
+          </w:tcPr>
+          <w:p>
+            <w:r>
+              <w:t>Steamed Milk</w:t>
+            </w:r>
+          </w:p>
+        </w:tc>
+        <w:tc>
+          <w:tcPr>
+            <w:tcW w:w="1250" w:type="pct"/>
+            <w:tcBorders>
+              <w:top w:val="single" w:sz="4" w:space="0" w:color="000000" w:themeColor="text1"/>
+              <w:left w:val="single" w:sz="4" w:space="0" w:color="000000" w:themeColor="text1"/>
+              <w:bottom w:val="single" w:sz="4" w:space="0" w:color="000000" w:themeColor="text1"/>
+              <w:right w:val="single" w:sz="4" w:space="0" w:color="000000" w:themeColor="text1"/>
+            </w:tcBorders>
+          </w:tcPr>
+          <w:p>
+            <w:pPr>
+              <w:cnfStyle w:val="000000000000" w:firstRow="0" w:lastRow="0" w:firstColumn="0" w:lastColumn="0" w:oddVBand="0" w:evenVBand="0" w:oddHBand="0" w:evenHBand="0" w:firstRowFirstColumn="0" w:firstRowLastColumn="0" w:lastRowFirstColumn="0" w:lastRowLastColumn="0"/>
+            </w:pPr>
+            <w:r>
+              <w:t>0,38</w:t>
+            </w:r>
+          </w:p>
+        </w:tc>
+        <w:tc>
+          <w:tcPr>
+            <w:tcW w:w="1250" w:type="pct"/>
+            <w:tcBorders>
+              <w:top w:val="single" w:sz="4" w:space="0" w:color="000000" w:themeColor="text1"/>
+              <w:left w:val="single" w:sz="4" w:space="0" w:color="000000" w:themeColor="text1"/>
+              <w:bottom w:val="single" w:sz="4" w:space="0" w:color="000000" w:themeColor="text1"/>
+              <w:right w:val="single" w:sz="4" w:space="0" w:color="000000" w:themeColor="text1"/>
+            </w:tcBorders>
+          </w:tcPr>
+          <w:p>
+            <w:pPr>
+              <w:cnfStyle w:val="000000000000" w:firstRow="0" w:lastRow="0" w:firstColumn="0" w:lastColumn="0" w:oddVBand="0" w:evenVBand="0" w:oddHBand="0" w:evenHBand="0" w:firstRowFirstColumn="0" w:firstRowLastColumn="0" w:lastRowFirstColumn="0" w:lastRowLastColumn="0"/>
+            </w:pPr>
+            <w:r>
+              <w:t>0,42</w:t>
+            </w:r>
+          </w:p>
+        </w:tc>
+        <w:tc>
+          <w:tcPr>
+            <w:tcW w:w="1250" w:type="pct"/>
+            <w:tcBorders>
+              <w:top w:val="single" w:sz="4" w:space="0" w:color="000000" w:themeColor="text1"/>
+              <w:left w:val="single" w:sz="4" w:space="0" w:color="000000" w:themeColor="text1"/>
+              <w:bottom w:val="single" w:sz="4" w:space="0" w:color="000000" w:themeColor="text1"/>
+            </w:tcBorders>
+          </w:tcPr>
+          <w:p>
+            <w:pPr>
+              <w:cnfStyle w:val="000000000000" w:firstRow="0" w:lastRow="0" w:firstColumn="0" w:lastColumn="0" w:oddVBand="0" w:evenVBand="0" w:oddHBand="0" w:evenHBand="0" w:firstRowFirstColumn="0" w:firstRowLastColumn="0" w:lastRowFirstColumn="0" w:lastRowLastColumn="0"/>
+            </w:pPr>
+            <w:r>
+              <w:t>0,45</w:t>
+            </w:r>
+          </w:p>
+        </w:tc>
+      </w:tr>
+      <w:tr>
+        <w:trPr>
+          <w:cnfStyle w:val="000000100000" w:firstRow="0" w:lastRow="0" w:firstColumn="0" w:lastColumn="0" w:oddVBand="0" w:evenVBand="0" w:oddHBand="1" w:evenHBand="0" w:firstRowFirstColumn="0" w:firstRowLastColumn="0" w:lastRowFirstColumn="0" w:lastRowLastColumn="0"/>
+        </w:trPr>
+        <w:tc>
+          <w:tcPr>
+            <w:cnfStyle w:val="001000000000" w:firstRow="0" w:lastRow="0" w:firstColumn="1" w:lastColumn="0" w:oddVBand="0" w:evenVBand="0" w:oddHBand="0" w:evenHBand="0" w:firstRowFirstColumn="0" w:firstRowLastColumn="0" w:lastRowFirstColumn="0" w:lastRowLastColumn="0"/>
+            <w:tcW w:w="1250" w:type="pct"/>
+            <w:tcBorders>
+              <w:top w:val="single" w:sz="4" w:space="0" w:color="000000" w:themeColor="text1"/>
+              <w:bottom w:val="single" w:sz="4" w:space="0" w:color="000000" w:themeColor="text1"/>
+              <w:right w:val="single" w:sz="4" w:space="0" w:color="000000" w:themeColor="text1"/>
+            </w:tcBorders>
+          </w:tcPr>
+          <w:p>
+            <w:r>
+              <w:t>Chocolate</w:t>
+            </w:r>
+          </w:p>
+        </w:tc>
+        <w:tc>
+          <w:tcPr>
+            <w:tcW w:w="1250" w:type="pct"/>
+            <w:tcBorders>
+              <w:top w:val="single" w:sz="4" w:space="0" w:color="000000" w:themeColor="text1"/>
+              <w:left w:val="single" w:sz="4" w:space="0" w:color="000000" w:themeColor="text1"/>
+              <w:bottom w:val="single" w:sz="4" w:space="0" w:color="000000" w:themeColor="text1"/>
+              <w:right w:val="single" w:sz="4" w:space="0" w:color="000000" w:themeColor="text1"/>
+            </w:tcBorders>
+          </w:tcPr>
+          <w:p>
+            <w:pPr>
+              <w:cnfStyle w:val="000000100000" w:firstRow="0" w:lastRow="0" w:firstColumn="0" w:lastColumn="0" w:oddVBand="0" w:evenVBand="0" w:oddHBand="1" w:evenHBand="0" w:firstRowFirstColumn="0" w:firstRowLastColumn="0" w:lastRowFirstColumn="0" w:lastRowLastColumn="0"/>
+            </w:pPr>
+            <w:r>
+              <w:t>0,99</w:t>
+            </w:r>
+          </w:p>
+        </w:tc>
+        <w:tc>
+          <w:tcPr>
+            <w:tcW w:w="1250" w:type="pct"/>
+            <w:tcBorders>
+              <w:top w:val="single" w:sz="4" w:space="0" w:color="000000" w:themeColor="text1"/>
+              <w:left w:val="single" w:sz="4" w:space="0" w:color="000000" w:themeColor="text1"/>
+              <w:bottom w:val="single" w:sz="4" w:space="0" w:color="000000" w:themeColor="text1"/>
+              <w:right w:val="single" w:sz="4" w:space="0" w:color="000000" w:themeColor="text1"/>
+            </w:tcBorders>
+          </w:tcPr>
+          <w:p>
+            <w:pPr>
+              <w:cnfStyle w:val="000000100000" w:firstRow="0" w:lastRow="0" w:firstColumn="0" w:lastColumn="0" w:oddVBand="0" w:evenVBand="0" w:oddHBand="1" w:evenHBand="0" w:firstRowFirstColumn="0" w:firstRowLastColumn="0" w:lastRowFirstColumn="0" w:lastRowLastColumn="0"/>
+            </w:pPr>
+            <w:r>
+              <w:t>1,49</w:t>
+            </w:r>
+          </w:p>
+        </w:tc>
+        <w:tc>
+          <w:tcPr>
+            <w:tcW w:w="1250" w:type="pct"/>
+            <w:tcBorders>
+              <w:top w:val="single" w:sz="4" w:space="0" w:color="000000" w:themeColor="text1"/>
+              <w:left w:val="single" w:sz="4" w:space="0" w:color="000000" w:themeColor="text1"/>
+              <w:bottom w:val="single" w:sz="4" w:space="0" w:color="000000" w:themeColor="text1"/>
+            </w:tcBorders>
+          </w:tcPr>
+          <w:p>
+            <w:pPr>
+              <w:cnfStyle w:val="000000100000" w:firstRow="0" w:lastRow="0" w:firstColumn="0" w:lastColumn="0" w:oddVBand="0" w:evenVBand="0" w:oddHBand="1" w:evenHBand="0" w:firstRowFirstColumn="0" w:firstRowLastColumn="0" w:lastRowFirstColumn="0" w:lastRowLastColumn="0"/>
+            </w:pPr>
+            <w:r>
+              <w:t>1,99</w:t>
+            </w:r>
+          </w:p>
+        </w:tc>
+      </w:tr>
+      <w:tr>
+        <w:tc>
+          <w:tcPr>
+            <w:cnfStyle w:val="001000000000" w:firstRow="0" w:lastRow="0" w:firstColumn="1" w:lastColumn="0" w:oddVBand="0" w:evenVBand="0" w:oddHBand="0" w:evenHBand="0" w:firstRowFirstColumn="0" w:firstRowLastColumn="0" w:lastRowFirstColumn="0" w:lastRowLastColumn="0"/>
+            <w:tcW w:w="1250" w:type="pct"/>
+            <w:tcBorders>
+              <w:top w:val="single" w:sz="4" w:space="0" w:color="000000" w:themeColor="text1"/>
+              <w:bottom w:val="single" w:sz="4" w:space="0" w:color="000000" w:themeColor="text1"/>
+              <w:right w:val="single" w:sz="4" w:space="0" w:color="000000" w:themeColor="text1"/>
+            </w:tcBorders>
+          </w:tcPr>
+          <w:p>
+            <w:r>
+              <w:t>Black Chocolate</w:t>
+            </w:r>
+          </w:p>
+        </w:tc>
+        <w:tc>
+          <w:tcPr>
+            <w:tcW w:w="1250" w:type="pct"/>
+            <w:tcBorders>
+              <w:top w:val="single" w:sz="4" w:space="0" w:color="000000" w:themeColor="text1"/>
+              <w:left w:val="single" w:sz="4" w:space="0" w:color="000000" w:themeColor="text1"/>
+              <w:bottom w:val="single" w:sz="4" w:space="0" w:color="000000" w:themeColor="text1"/>
+              <w:right w:val="single" w:sz="4" w:space="0" w:color="000000" w:themeColor="text1"/>
+            </w:tcBorders>
+          </w:tcPr>
+          <w:p>
+            <w:pPr>
+              <w:cnfStyle w:val="000000000000" w:firstRow="0" w:lastRow="0" w:firstColumn="0" w:lastColumn="0" w:oddVBand="0" w:evenVBand="0" w:oddHBand="0" w:evenHBand="0" w:firstRowFirstColumn="0" w:firstRowLastColumn="0" w:lastRowFirstColumn="0" w:lastRowLastColumn="0"/>
+            </w:pPr>
+            <w:r>
+              <w:t>0,56</w:t>
+            </w:r>
+          </w:p>
+        </w:tc>
+        <w:tc>
+          <w:tcPr>
+            <w:tcW w:w="1250" w:type="pct"/>
+            <w:tcBorders>
+              <w:top w:val="single" w:sz="4" w:space="0" w:color="000000" w:themeColor="text1"/>
+              <w:left w:val="single" w:sz="4" w:space="0" w:color="000000" w:themeColor="text1"/>
+              <w:bottom w:val="single" w:sz="4" w:space="0" w:color="000000" w:themeColor="text1"/>
+              <w:right w:val="single" w:sz="4" w:space="0" w:color="000000" w:themeColor="text1"/>
+            </w:tcBorders>
+          </w:tcPr>
+          <w:p>
+            <w:pPr>
+              <w:cnfStyle w:val="000000000000" w:firstRow="0" w:lastRow="0" w:firstColumn="0" w:lastColumn="0" w:oddVBand="0" w:evenVBand="0" w:oddHBand="0" w:evenHBand="0" w:firstRowFirstColumn="0" w:firstRowLastColumn="0" w:lastRowFirstColumn="0" w:lastRowLastColumn="0"/>
+            </w:pPr>
+            <w:r>
+              <w:t>0,59</w:t>
+            </w:r>
+          </w:p>
+        </w:tc>
+        <w:tc>
+          <w:tcPr>
+            <w:tcW w:w="1250" w:type="pct"/>
+            <w:tcBorders>
+              <w:top w:val="single" w:sz="4" w:space="0" w:color="000000" w:themeColor="text1"/>
+              <w:left w:val="single" w:sz="4" w:space="0" w:color="000000" w:themeColor="text1"/>
+              <w:bottom w:val="single" w:sz="4" w:space="0" w:color="000000" w:themeColor="text1"/>
+            </w:tcBorders>
+          </w:tcPr>
+          <w:p>
+            <w:pPr>
+              <w:cnfStyle w:val="000000000000" w:firstRow="0" w:lastRow="0" w:firstColumn="0" w:lastColumn="0" w:oddVBand="0" w:evenVBand="0" w:oddHBand="0" w:evenHBand="0" w:firstRowFirstColumn="0" w:firstRowLastColumn="0" w:lastRowFirstColumn="0" w:lastRowLastColumn="0"/>
+            </w:pPr>
+            <w:r>
+              <w:t>0,67</w:t>
+            </w:r>
+          </w:p>
+        </w:tc>
+      </w:tr>
+      <w:tr>
+        <w:trPr>
+          <w:cnfStyle w:val="000000100000" w:firstRow="0" w:lastRow="0" w:firstColumn="0" w:lastColumn="0" w:oddVBand="0" w:evenVBand="0" w:oddHBand="1" w:evenHBand="0" w:firstRowFirstColumn="0" w:firstRowLastColumn="0" w:lastRowFirstColumn="0" w:lastRowLastColumn="0"/>
+        </w:trPr>
+        <w:tc>
+          <w:tcPr>
+            <w:cnfStyle w:val="001000000000" w:firstRow="0" w:lastRow="0" w:firstColumn="1" w:lastColumn="0" w:oddVBand="0" w:evenVBand="0" w:oddHBand="0" w:evenHBand="0" w:firstRowFirstColumn="0" w:firstRowLastColumn="0" w:lastRowFirstColumn="0" w:lastRowLastColumn="0"/>
+            <w:tcW w:w="1250" w:type="pct"/>
+            <w:tcBorders>
+              <w:top w:val="single" w:sz="4" w:space="0" w:color="000000" w:themeColor="text1"/>
+              <w:bottom w:val="single" w:sz="4" w:space="0" w:color="000000" w:themeColor="text1"/>
+              <w:right w:val="single" w:sz="4" w:space="0" w:color="000000" w:themeColor="text1"/>
+            </w:tcBorders>
+          </w:tcPr>
+          <w:p>
+            <w:r>
+              <w:t>White Chocolate</w:t>
+            </w:r>
+          </w:p>
+        </w:tc>
+        <w:tc>
+          <w:tcPr>
+            <w:tcW w:w="1250" w:type="pct"/>
+            <w:tcBorders>
+              <w:top w:val="single" w:sz="4" w:space="0" w:color="000000" w:themeColor="text1"/>
+              <w:left w:val="single" w:sz="4" w:space="0" w:color="000000" w:themeColor="text1"/>
+              <w:bottom w:val="single" w:sz="4" w:space="0" w:color="000000" w:themeColor="text1"/>
+              <w:right w:val="single" w:sz="4" w:space="0" w:color="000000" w:themeColor="text1"/>
+            </w:tcBorders>
+          </w:tcPr>
+          <w:p>
+            <w:pPr>
+              <w:cnfStyle w:val="000000100000" w:firstRow="0" w:lastRow="0" w:firstColumn="0" w:lastColumn="0" w:oddVBand="0" w:evenVBand="0" w:oddHBand="1" w:evenHBand="0" w:firstRowFirstColumn="0" w:firstRowLastColumn="0" w:lastRowFirstColumn="0" w:lastRowLastColumn="0"/>
+            </w:pPr>
+            <w:r>
+              <w:t>0,60</w:t>
+            </w:r>
+          </w:p>
+        </w:tc>
+        <w:tc>
+          <w:tcPr>
+            <w:tcW w:w="1250" w:type="pct"/>
+            <w:tcBorders>
+              <w:top w:val="single" w:sz="4" w:space="0" w:color="000000" w:themeColor="text1"/>
+              <w:left w:val="single" w:sz="4" w:space="0" w:color="000000" w:themeColor="text1"/>
+              <w:bottom w:val="single" w:sz="4" w:space="0" w:color="000000" w:themeColor="text1"/>
+              <w:right w:val="single" w:sz="4" w:space="0" w:color="000000" w:themeColor="text1"/>
+            </w:tcBorders>
+          </w:tcPr>
+          <w:p>
+            <w:pPr>
+              <w:cnfStyle w:val="000000100000" w:firstRow="0" w:lastRow="0" w:firstColumn="0" w:lastColumn="0" w:oddVBand="0" w:evenVBand="0" w:oddHBand="1" w:evenHBand="0" w:firstRowFirstColumn="0" w:firstRowLastColumn="0" w:lastRowFirstColumn="0" w:lastRowLastColumn="0"/>
+            </w:pPr>
+            <w:r>
+              <w:t>0,79</w:t>
+            </w:r>
+          </w:p>
+        </w:tc>
+        <w:tc>
+          <w:tcPr>
+            <w:tcW w:w="1250" w:type="pct"/>
+            <w:tcBorders>
+              <w:top w:val="single" w:sz="4" w:space="0" w:color="000000" w:themeColor="text1"/>
+              <w:left w:val="single" w:sz="4" w:space="0" w:color="000000" w:themeColor="text1"/>
+              <w:bottom w:val="single" w:sz="4" w:space="0" w:color="000000" w:themeColor="text1"/>
+            </w:tcBorders>
+          </w:tcPr>
+          <w:p>
+            <w:pPr>
+              <w:cnfStyle w:val="000000100000" w:firstRow="0" w:lastRow="0" w:firstColumn="0" w:lastColumn="0" w:oddVBand="0" w:evenVBand="0" w:oddHBand="1" w:evenHBand="0" w:firstRowFirstColumn="0" w:firstRowLastColumn="0" w:lastRowFirstColumn="0" w:lastRowLastColumn="0"/>
+            </w:pPr>
+            <w:r>
+              <w:t>0,98</w:t>
+            </w:r>
+          </w:p>
+        </w:tc>
+      </w:tr>
+      <w:tr>
+        <w:tc>
+          <w:tcPr>
+            <w:cnfStyle w:val="001000000000" w:firstRow="0" w:lastRow="0" w:firstColumn="1" w:lastColumn="0" w:oddVBand="0" w:evenVBand="0" w:oddHBand="0" w:evenHBand="0" w:firstRowFirstColumn="0" w:firstRowLastColumn="0" w:lastRowFirstColumn="0" w:lastRowLastColumn="0"/>
+            <w:tcW w:w="1250" w:type="pct"/>
+            <w:tcBorders>
+              <w:top w:val="single" w:sz="4" w:space="0" w:color="000000" w:themeColor="text1"/>
+              <w:bottom w:val="single" w:sz="4" w:space="0" w:color="000000" w:themeColor="text1"/>
+              <w:right w:val="single" w:sz="4" w:space="0" w:color="000000" w:themeColor="text1"/>
+            </w:tcBorders>
+          </w:tcPr>
+          <w:p>
+            <w:r>
+              <w:t>Half Milk</w:t>
+            </w:r>
+          </w:p>
+        </w:tc>
+        <w:tc>
+          <w:tcPr>
+            <w:tcW w:w="1250" w:type="pct"/>
+            <w:tcBorders>
+              <w:top w:val="single" w:sz="4" w:space="0" w:color="000000" w:themeColor="text1"/>
+              <w:left w:val="single" w:sz="4" w:space="0" w:color="000000" w:themeColor="text1"/>
+              <w:bottom w:val="single" w:sz="4" w:space="0" w:color="000000" w:themeColor="text1"/>
+              <w:right w:val="single" w:sz="4" w:space="0" w:color="000000" w:themeColor="text1"/>
+            </w:tcBorders>
+          </w:tcPr>
+          <w:p>
+            <w:pPr>
+              <w:cnfStyle w:val="000000000000" w:firstRow="0" w:lastRow="0" w:firstColumn="0" w:lastColumn="0" w:oddVBand="0" w:evenVBand="0" w:oddHBand="0" w:evenHBand="0" w:firstRowFirstColumn="0" w:firstRowLastColumn="0" w:lastRowFirstColumn="0" w:lastRowLastColumn="0"/>
+            </w:pPr>
+            <w:r>
+              <w:t>0,15</w:t>
+            </w:r>
+          </w:p>
+        </w:tc>
+        <w:tc>
+          <w:tcPr>
+            <w:tcW w:w="1250" w:type="pct"/>
+            <w:tcBorders>
+              <w:top w:val="single" w:sz="4" w:space="0" w:color="000000" w:themeColor="text1"/>
+              <w:left w:val="single" w:sz="4" w:space="0" w:color="000000" w:themeColor="text1"/>
+              <w:bottom w:val="single" w:sz="4" w:space="0" w:color="000000" w:themeColor="text1"/>
+              <w:right w:val="single" w:sz="4" w:space="0" w:color="000000" w:themeColor="text1"/>
+            </w:tcBorders>
+          </w:tcPr>
+          <w:p>
+            <w:pPr>
+              <w:cnfStyle w:val="000000000000" w:firstRow="0" w:lastRow="0" w:firstColumn="0" w:lastColumn="0" w:oddVBand="0" w:evenVBand="0" w:oddHBand="0" w:evenHBand="0" w:firstRowFirstColumn="0" w:firstRowLastColumn="0" w:lastRowFirstColumn="0" w:lastRowLastColumn="0"/>
+            </w:pPr>
+            <w:r>
+              <w:t>0,30</w:t>
+            </w:r>
+          </w:p>
+        </w:tc>
+        <w:tc>
+          <w:tcPr>
+            <w:tcW w:w="1250" w:type="pct"/>
+            <w:tcBorders>
+              <w:top w:val="single" w:sz="4" w:space="0" w:color="000000" w:themeColor="text1"/>
+              <w:left w:val="single" w:sz="4" w:space="0" w:color="000000" w:themeColor="text1"/>
+              <w:bottom w:val="single" w:sz="4" w:space="0" w:color="000000" w:themeColor="text1"/>
+            </w:tcBorders>
+          </w:tcPr>
+          <w:p>
+            <w:pPr>
+              <w:cnfStyle w:val="000000000000" w:firstRow="0" w:lastRow="0" w:firstColumn="0" w:lastColumn="0" w:oddVBand="0" w:evenVBand="0" w:oddHBand="0" w:evenHBand="0" w:firstRowFirstColumn="0" w:firstRowLastColumn="0" w:lastRowFirstColumn="0" w:lastRowLastColumn="0"/>
+            </w:pPr>
+            <w:r>
+              <w:t>0,45</w:t>
+            </w:r>
+          </w:p>
+        </w:tc>
+      </w:tr>
+      <w:tr>
+        <w:trPr>
+          <w:cnfStyle w:val="000000100000" w:firstRow="0" w:lastRow="0" w:firstColumn="0" w:lastColumn="0" w:oddVBand="0" w:evenVBand="0" w:oddHBand="1" w:evenHBand="0" w:firstRowFirstColumn="0" w:firstRowLastColumn="0" w:lastRowFirstColumn="0" w:lastRowLastColumn="0"/>
+        </w:trPr>
+        <w:tc>
+          <w:tcPr>
+            <w:cnfStyle w:val="001000000000" w:firstRow="0" w:lastRow="0" w:firstColumn="1" w:lastColumn="0" w:oddVBand="0" w:evenVBand="0" w:oddHBand="0" w:evenHBand="0" w:firstRowFirstColumn="0" w:firstRowLastColumn="0" w:lastRowFirstColumn="0" w:lastRowLastColumn="0"/>
+            <w:tcW w:w="1250" w:type="pct"/>
+            <w:tcBorders>
+              <w:top w:val="single" w:sz="4" w:space="0" w:color="000000" w:themeColor="text1"/>
+              <w:bottom w:val="single" w:sz="4" w:space="0" w:color="000000" w:themeColor="text1"/>
+              <w:right w:val="single" w:sz="4" w:space="0" w:color="000000" w:themeColor="text1"/>
+            </w:tcBorders>
+          </w:tcPr>
+          <w:p>
+            <w:r>
+              <w:t>Vanilla Sugar</w:t>
+            </w:r>
+          </w:p>
+        </w:tc>
+        <w:tc>
+          <w:tcPr>
+            <w:tcW w:w="1250" w:type="pct"/>
+            <w:tcBorders>
+              <w:top w:val="single" w:sz="4" w:space="0" w:color="000000" w:themeColor="text1"/>
+              <w:left w:val="single" w:sz="4" w:space="0" w:color="000000" w:themeColor="text1"/>
+              <w:bottom w:val="single" w:sz="4" w:space="0" w:color="000000" w:themeColor="text1"/>
+              <w:right w:val="single" w:sz="4" w:space="0" w:color="000000" w:themeColor="text1"/>
+            </w:tcBorders>
+          </w:tcPr>
+          <w:p>
+            <w:pPr>
+              <w:cnfStyle w:val="000000100000" w:firstRow="0" w:lastRow="0" w:firstColumn="0" w:lastColumn="0" w:oddVBand="0" w:evenVBand="0" w:oddHBand="1" w:evenHBand="0" w:firstRowFirstColumn="0" w:firstRowLastColumn="0" w:lastRowFirstColumn="0" w:lastRowLastColumn="0"/>
+            </w:pPr>
+            <w:r>
+              <w:t>0,08</w:t>
+            </w:r>
+          </w:p>
+        </w:tc>
+        <w:tc>
+          <w:tcPr>
+            <w:tcW w:w="1250" w:type="pct"/>
+            <w:tcBorders>
+              <w:top w:val="single" w:sz="4" w:space="0" w:color="000000" w:themeColor="text1"/>
+              <w:left w:val="single" w:sz="4" w:space="0" w:color="000000" w:themeColor="text1"/>
+              <w:bottom w:val="single" w:sz="4" w:space="0" w:color="000000" w:themeColor="text1"/>
+              <w:right w:val="single" w:sz="4" w:space="0" w:color="000000" w:themeColor="text1"/>
+            </w:tcBorders>
+          </w:tcPr>
+          <w:p>
+            <w:pPr>
+              <w:cnfStyle w:val="000000100000" w:firstRow="0" w:lastRow="0" w:firstColumn="0" w:lastColumn="0" w:oddVBand="0" w:evenVBand="0" w:oddHBand="1" w:evenHBand="0" w:firstRowFirstColumn="0" w:firstRowLastColumn="0" w:lastRowFirstColumn="0" w:lastRowLastColumn="0"/>
+            </w:pPr>
+            <w:r>
+              <w:t>0,12</w:t>
+            </w:r>
+          </w:p>
+        </w:tc>
+        <w:tc>
+          <w:tcPr>
+            <w:tcW w:w="1250" w:type="pct"/>
+            <w:tcBorders>
+              <w:top w:val="single" w:sz="4" w:space="0" w:color="000000" w:themeColor="text1"/>
+              <w:left w:val="single" w:sz="4" w:space="0" w:color="000000" w:themeColor="text1"/>
+              <w:bottom w:val="single" w:sz="4" w:space="0" w:color="000000" w:themeColor="text1"/>
+            </w:tcBorders>
+          </w:tcPr>
+          <w:p>
+            <w:pPr>
+              <w:cnfStyle w:val="000000100000" w:firstRow="0" w:lastRow="0" w:firstColumn="0" w:lastColumn="0" w:oddVBand="0" w:evenVBand="0" w:oddHBand="1" w:evenHBand="0" w:firstRowFirstColumn="0" w:firstRowLastColumn="0" w:lastRowFirstColumn="0" w:lastRowLastColumn="0"/>
+            </w:pPr>
+            <w:r>
+              <w:t>0,17</w:t>
+            </w:r>
+          </w:p>
+        </w:tc>
+      </w:tr>
+      <w:tr>
+        <w:tc>
+          <w:tcPr>
+            <w:cnfStyle w:val="001000000000" w:firstRow="0" w:lastRow="0" w:firstColumn="1" w:lastColumn="0" w:oddVBand="0" w:evenVBand="0" w:oddHBand="0" w:evenHBand="0" w:firstRowFirstColumn="0" w:firstRowLastColumn="0" w:lastRowFirstColumn="0" w:lastRowLastColumn="0"/>
+            <w:tcW w:w="1250" w:type="pct"/>
+            <w:tcBorders>
+              <w:top w:val="single" w:sz="4" w:space="0" w:color="000000" w:themeColor="text1"/>
+              <w:bottom w:val="single" w:sz="4" w:space="0" w:color="000000" w:themeColor="text1"/>
+              <w:right w:val="single" w:sz="4" w:space="0" w:color="000000" w:themeColor="text1"/>
+            </w:tcBorders>
+          </w:tcPr>
+          <w:p>
+            <w:r>
+              <w:t>Cream</w:t>
+            </w:r>
+          </w:p>
+        </w:tc>
+        <w:tc>
+          <w:tcPr>
+            <w:tcW w:w="1250" w:type="pct"/>
+            <w:tcBorders>
+              <w:top w:val="single" w:sz="4" w:space="0" w:color="000000" w:themeColor="text1"/>
+              <w:left w:val="single" w:sz="4" w:space="0" w:color="000000" w:themeColor="text1"/>
+              <w:bottom w:val="single" w:sz="4" w:space="0" w:color="000000" w:themeColor="text1"/>
+              <w:right w:val="single" w:sz="4" w:space="0" w:color="000000" w:themeColor="text1"/>
+            </w:tcBorders>
+          </w:tcPr>
+          <w:p>
+            <w:pPr>
+              <w:cnfStyle w:val="000000000000" w:firstRow="0" w:lastRow="0" w:firstColumn="0" w:lastColumn="0" w:oddVBand="0" w:evenVBand="0" w:oddHBand="0" w:evenHBand="0" w:firstRowFirstColumn="0" w:firstRowLastColumn="0" w:lastRowFirstColumn="0" w:lastRowLastColumn="0"/>
+            </w:pPr>
+            <w:r>
+              <w:t>0,30</w:t>
+            </w:r>
+          </w:p>
+        </w:tc>
+        <w:tc>
+          <w:tcPr>
+            <w:tcW w:w="1250" w:type="pct"/>
+            <w:tcBorders>
+              <w:top w:val="single" w:sz="4" w:space="0" w:color="000000" w:themeColor="text1"/>
+              <w:left w:val="single" w:sz="4" w:space="0" w:color="000000" w:themeColor="text1"/>
+              <w:bottom w:val="single" w:sz="4" w:space="0" w:color="000000" w:themeColor="text1"/>
+              <w:right w:val="single" w:sz="4" w:space="0" w:color="000000" w:themeColor="text1"/>
+            </w:tcBorders>
+          </w:tcPr>
+          <w:p>
+            <w:pPr>
+              <w:cnfStyle w:val="000000000000" w:firstRow="0" w:lastRow="0" w:firstColumn="0" w:lastColumn="0" w:oddVBand="0" w:evenVBand="0" w:oddHBand="0" w:evenHBand="0" w:firstRowFirstColumn="0" w:firstRowLastColumn="0" w:lastRowFirstColumn="0" w:lastRowLastColumn="0"/>
+            </w:pPr>
+            <w:r>
+              <w:t>0,48</w:t>
+            </w:r>
+          </w:p>
+        </w:tc>
+        <w:tc>
+          <w:tcPr>
+            <w:tcW w:w="1250" w:type="pct"/>
+            <w:tcBorders>
+              <w:top w:val="single" w:sz="4" w:space="0" w:color="000000" w:themeColor="text1"/>
+              <w:left w:val="single" w:sz="4" w:space="0" w:color="000000" w:themeColor="text1"/>
+              <w:bottom w:val="single" w:sz="4" w:space="0" w:color="000000" w:themeColor="text1"/>
+            </w:tcBorders>
+          </w:tcPr>
+          <w:p>
+            <w:pPr>
+              <w:cnfStyle w:val="000000000000" w:firstRow="0" w:lastRow="0" w:firstColumn="0" w:lastColumn="0" w:oddVBand="0" w:evenVBand="0" w:oddHBand="0" w:evenHBand="0" w:firstRowFirstColumn="0" w:firstRowLastColumn="0" w:lastRowFirstColumn="0" w:lastRowLastColumn="0"/>
+            </w:pPr>
+            <w:r>
+              <w:t>0,56</w:t>
+            </w:r>
+          </w:p>
+        </w:tc>
+      </w:tr>
+      <w:tr>
+        <w:trPr>
+          <w:cnfStyle w:val="000000100000" w:firstRow="0" w:lastRow="0" w:firstColumn="0" w:lastColumn="0" w:oddVBand="0" w:evenVBand="0" w:oddHBand="1" w:evenHBand="0" w:firstRowFirstColumn="0" w:firstRowLastColumn="0" w:lastRowFirstColumn="0" w:lastRowLastColumn="0"/>
+        </w:trPr>
+        <w:tc>
+          <w:tcPr>
+            <w:cnfStyle w:val="001000000000" w:firstRow="0" w:lastRow="0" w:firstColumn="1" w:lastColumn="0" w:oddVBand="0" w:evenVBand="0" w:oddHBand="0" w:evenHBand="0" w:firstRowFirstColumn="0" w:firstRowLastColumn="0" w:lastRowFirstColumn="0" w:lastRowLastColumn="0"/>
+            <w:tcW w:w="1250" w:type="pct"/>
+            <w:tcBorders>
+              <w:top w:val="single" w:sz="4" w:space="0" w:color="000000" w:themeColor="text1"/>
+              <w:bottom w:val="single" w:sz="4" w:space="0" w:color="000000" w:themeColor="text1"/>
+              <w:right w:val="single" w:sz="4" w:space="0" w:color="000000" w:themeColor="text1"/>
+            </w:tcBorders>
+          </w:tcPr>
+          <w:p>
+            <w:r>
+              <w:t>Honey</w:t>
+            </w:r>
+          </w:p>
+        </w:tc>
+        <w:tc>
+          <w:tcPr>
+            <w:tcW w:w="1250" w:type="pct"/>
+            <w:tcBorders>
+              <w:top w:val="single" w:sz="4" w:space="0" w:color="000000" w:themeColor="text1"/>
+              <w:left w:val="single" w:sz="4" w:space="0" w:color="000000" w:themeColor="text1"/>
+              <w:bottom w:val="single" w:sz="4" w:space="0" w:color="000000" w:themeColor="text1"/>
+              <w:right w:val="single" w:sz="4" w:space="0" w:color="000000" w:themeColor="text1"/>
+            </w:tcBorders>
+          </w:tcPr>
+          <w:p>
+            <w:pPr>
+              <w:cnfStyle w:val="000000100000" w:firstRow="0" w:lastRow="0" w:firstColumn="0" w:lastColumn="0" w:oddVBand="0" w:evenVBand="0" w:oddHBand="1" w:evenHBand="0" w:firstRowFirstColumn="0" w:firstRowLastColumn="0" w:lastRowFirstColumn="0" w:lastRowLastColumn="0"/>
+            </w:pPr>
+            <w:r>
+              <w:t>0,69</w:t>
+            </w:r>
+          </w:p>
+        </w:tc>
+        <w:tc>
+          <w:tcPr>
+            <w:tcW w:w="1250" w:type="pct"/>
+            <w:tcBorders>
+              <w:top w:val="single" w:sz="4" w:space="0" w:color="000000" w:themeColor="text1"/>
+              <w:left w:val="single" w:sz="4" w:space="0" w:color="000000" w:themeColor="text1"/>
+              <w:bottom w:val="single" w:sz="4" w:space="0" w:color="000000" w:themeColor="text1"/>
+              <w:right w:val="single" w:sz="4" w:space="0" w:color="000000" w:themeColor="text1"/>
+            </w:tcBorders>
+          </w:tcPr>
+          <w:p>
+            <w:pPr>
+              <w:cnfStyle w:val="000000100000" w:firstRow="0" w:lastRow="0" w:firstColumn="0" w:lastColumn="0" w:oddVBand="0" w:evenVBand="0" w:oddHBand="1" w:evenHBand="0" w:firstRowFirstColumn="0" w:firstRowLastColumn="0" w:lastRowFirstColumn="0" w:lastRowLastColumn="0"/>
+            </w:pPr>
+            <w:r>
+              <w:t>0,89</w:t>
+            </w:r>
+          </w:p>
+        </w:tc>
+        <w:tc>
+          <w:tcPr>
+            <w:tcW w:w="1250" w:type="pct"/>
+            <w:tcBorders>
+              <w:top w:val="single" w:sz="4" w:space="0" w:color="000000" w:themeColor="text1"/>
+              <w:left w:val="single" w:sz="4" w:space="0" w:color="000000" w:themeColor="text1"/>
+              <w:bottom w:val="single" w:sz="4" w:space="0" w:color="000000" w:themeColor="text1"/>
+            </w:tcBorders>
+          </w:tcPr>
+          <w:p>
+            <w:pPr>
+              <w:cnfStyle w:val="000000100000" w:firstRow="0" w:lastRow="0" w:firstColumn="0" w:lastColumn="0" w:oddVBand="0" w:evenVBand="0" w:oddHBand="1" w:evenHBand="0" w:firstRowFirstColumn="0" w:firstRowLastColumn="0" w:lastRowFirstColumn="0" w:lastRowLastColumn="0"/>
+            </w:pPr>
+            <w:r>
+              <w:t>1,09</w:t>
+            </w:r>
+          </w:p>
+        </w:tc>
+      </w:tr>
+      <w:tr>
+        <w:tc>
+          <w:tcPr>
+            <w:cnfStyle w:val="001000000000" w:firstRow="0" w:lastRow="0" w:firstColumn="1" w:lastColumn="0" w:oddVBand="0" w:evenVBand="0" w:oddHBand="0" w:evenHBand="0" w:firstRowFirstColumn="0" w:firstRowLastColumn="0" w:lastRowFirstColumn="0" w:lastRowLastColumn="0"/>
+            <w:tcW w:w="1250" w:type="pct"/>
+            <w:tcBorders>
+              <w:top w:val="single" w:sz="4" w:space="0" w:color="000000" w:themeColor="text1"/>
+              <w:bottom w:val="single" w:sz="4" w:space="0" w:color="000000" w:themeColor="text1"/>
+              <w:right w:val="single" w:sz="4" w:space="0" w:color="000000" w:themeColor="text1"/>
+            </w:tcBorders>
+          </w:tcPr>
+          <w:p>
+            <w:r>
+              <w:t>Ice cream</w:t>
+            </w:r>
+          </w:p>
+        </w:tc>
+        <w:tc>
+          <w:tcPr>
+            <w:tcW w:w="1250" w:type="pct"/>
+            <w:tcBorders>
+              <w:top w:val="single" w:sz="4" w:space="0" w:color="000000" w:themeColor="text1"/>
+              <w:left w:val="single" w:sz="4" w:space="0" w:color="000000" w:themeColor="text1"/>
+              <w:bottom w:val="single" w:sz="4" w:space="0" w:color="000000" w:themeColor="text1"/>
+              <w:right w:val="single" w:sz="4" w:space="0" w:color="000000" w:themeColor="text1"/>
+            </w:tcBorders>
+          </w:tcPr>
+          <w:p>
+            <w:pPr>
+              <w:cnfStyle w:val="000000000000" w:firstRow="0" w:lastRow="0" w:firstColumn="0" w:lastColumn="0" w:oddVBand="0" w:evenVBand="0" w:oddHBand="0" w:evenHBand="0" w:firstRowFirstColumn="0" w:firstRowLastColumn="0" w:lastRowFirstColumn="0" w:lastRowLastColumn="0"/>
+            </w:pPr>
+            <w:r>
+              <w:t>1,02</w:t>
+            </w:r>
+          </w:p>
+        </w:tc>
+        <w:tc>
+          <w:tcPr>
+            <w:tcW w:w="1250" w:type="pct"/>
+            <w:tcBorders>
+              <w:top w:val="single" w:sz="4" w:space="0" w:color="000000" w:themeColor="text1"/>
+              <w:left w:val="single" w:sz="4" w:space="0" w:color="000000" w:themeColor="text1"/>
+              <w:bottom w:val="single" w:sz="4" w:space="0" w:color="000000" w:themeColor="text1"/>
+              <w:right w:val="single" w:sz="4" w:space="0" w:color="000000" w:themeColor="text1"/>
+            </w:tcBorders>
+          </w:tcPr>
+          <w:p>
+            <w:pPr>
+              <w:cnfStyle w:val="000000000000" w:firstRow="0" w:lastRow="0" w:firstColumn="0" w:lastColumn="0" w:oddVBand="0" w:evenVBand="0" w:oddHBand="0" w:evenHBand="0" w:firstRowFirstColumn="0" w:firstRowLastColumn="0" w:lastRowFirstColumn="0" w:lastRowLastColumn="0"/>
+            </w:pPr>
+            <w:r>
+              <w:t>1,52</w:t>
+            </w:r>
+          </w:p>
+        </w:tc>
+        <w:tc>
+          <w:tcPr>
+            <w:tcW w:w="1250" w:type="pct"/>
+            <w:tcBorders>
+              <w:top w:val="single" w:sz="4" w:space="0" w:color="000000" w:themeColor="text1"/>
+              <w:left w:val="single" w:sz="4" w:space="0" w:color="000000" w:themeColor="text1"/>
+              <w:bottom w:val="single" w:sz="4" w:space="0" w:color="000000" w:themeColor="text1"/>
+            </w:tcBorders>
+          </w:tcPr>
+          <w:p>
+            <w:pPr>
+              <w:cnfStyle w:val="000000000000" w:firstRow="0" w:lastRow="0" w:firstColumn="0" w:lastColumn="0" w:oddVBand="0" w:evenVBand="0" w:oddHBand="0" w:evenHBand="0" w:firstRowFirstColumn="0" w:firstRowLastColumn="0" w:lastRowFirstColumn="0" w:lastRowLastColumn="0"/>
+            </w:pPr>
+            <w:r>
+              <w:t>2,02</w:t>
+            </w:r>
+          </w:p>
+        </w:tc>
+      </w:tr>
+      <w:tr>
+        <w:trPr>
+          <w:cnfStyle w:val="000000100000" w:firstRow="0" w:lastRow="0" w:firstColumn="0" w:lastColumn="0" w:oddVBand="0" w:evenVBand="0" w:oddHBand="1" w:evenHBand="0" w:firstRowFirstColumn="0" w:firstRowLastColumn="0" w:lastRowFirstColumn="0" w:lastRowLastColumn="0"/>
+        </w:trPr>
+        <w:tc>
+          <w:tcPr>
+            <w:cnfStyle w:val="001000000000" w:firstRow="0" w:lastRow="0" w:firstColumn="1" w:lastColumn="0" w:oddVBand="0" w:evenVBand="0" w:oddHBand="0" w:evenHBand="0" w:firstRowFirstColumn="0" w:firstRowLastColumn="0" w:lastRowFirstColumn="0" w:lastRowLastColumn="0"/>
+            <w:tcW w:w="1250" w:type="pct"/>
+            <w:tcBorders>
+              <w:top w:val="single" w:sz="4" w:space="0" w:color="000000" w:themeColor="text1"/>
+              <w:bottom w:val="single" w:sz="4" w:space="0" w:color="000000" w:themeColor="text1"/>
+              <w:right w:val="single" w:sz="4" w:space="0" w:color="000000" w:themeColor="text1"/>
+            </w:tcBorders>
+          </w:tcPr>
+          <w:p>
+            <w:r>
+              <w:t>Milk</w:t>
+            </w:r>
+          </w:p>
+        </w:tc>
+        <w:tc>
+          <w:tcPr>
+            <w:tcW w:w="1250" w:type="pct"/>
+            <w:tcBorders>
+              <w:top w:val="single" w:sz="4" w:space="0" w:color="000000" w:themeColor="text1"/>
+              <w:left w:val="single" w:sz="4" w:space="0" w:color="000000" w:themeColor="text1"/>
+              <w:bottom w:val="single" w:sz="4" w:space="0" w:color="000000" w:themeColor="text1"/>
+              <w:right w:val="single" w:sz="4" w:space="0" w:color="000000" w:themeColor="text1"/>
+            </w:tcBorders>
+          </w:tcPr>
+          <w:p>
+            <w:pPr>
+              <w:cnfStyle w:val="000000100000" w:firstRow="0" w:lastRow="0" w:firstColumn="0" w:lastColumn="0" w:oddVBand="0" w:evenVBand="0" w:oddHBand="1" w:evenHBand="0" w:firstRowFirstColumn="0" w:firstRowLastColumn="0" w:lastRowFirstColumn="0" w:lastRowLastColumn="0"/>
+            </w:pPr>
+            <w:r>
+              <w:t>0,37</w:t>
+            </w:r>
+          </w:p>
+        </w:tc>
+        <w:tc>
+          <w:tcPr>
+            <w:tcW w:w="1250" w:type="pct"/>
+            <w:tcBorders>
+              <w:top w:val="single" w:sz="4" w:space="0" w:color="000000" w:themeColor="text1"/>
+              <w:left w:val="single" w:sz="4" w:space="0" w:color="000000" w:themeColor="text1"/>
+              <w:bottom w:val="single" w:sz="4" w:space="0" w:color="000000" w:themeColor="text1"/>
+              <w:right w:val="single" w:sz="4" w:space="0" w:color="000000" w:themeColor="text1"/>
+            </w:tcBorders>
+          </w:tcPr>
+          <w:p>
+            <w:pPr>
+              <w:cnfStyle w:val="000000100000" w:firstRow="0" w:lastRow="0" w:firstColumn="0" w:lastColumn="0" w:oddVBand="0" w:evenVBand="0" w:oddHBand="1" w:evenHBand="0" w:firstRowFirstColumn="0" w:firstRowLastColumn="0" w:lastRowFirstColumn="0" w:lastRowLastColumn="0"/>
+            </w:pPr>
+            <w:r>
+              <w:t>0,41</w:t>
+            </w:r>
+          </w:p>
+        </w:tc>
+        <w:tc>
+          <w:tcPr>
+            <w:tcW w:w="1250" w:type="pct"/>
+            <w:tcBorders>
+              <w:top w:val="single" w:sz="4" w:space="0" w:color="000000" w:themeColor="text1"/>
+              <w:left w:val="single" w:sz="4" w:space="0" w:color="000000" w:themeColor="text1"/>
+              <w:bottom w:val="single" w:sz="4" w:space="0" w:color="000000" w:themeColor="text1"/>
+            </w:tcBorders>
+          </w:tcPr>
+          <w:p>
+            <w:pPr>
+              <w:cnfStyle w:val="000000100000" w:firstRow="0" w:lastRow="0" w:firstColumn="0" w:lastColumn="0" w:oddVBand="0" w:evenVBand="0" w:oddHBand="1" w:evenHBand="0" w:firstRowFirstColumn="0" w:firstRowLastColumn="0" w:lastRowFirstColumn="0" w:lastRowLastColumn="0"/>
+            </w:pPr>
+            <w:r>
+              <w:t>0,48</w:t>
+            </w:r>
+          </w:p>
+        </w:tc>
+      </w:tr>
+      <w:tr>
+        <w:tc>
+          <w:tcPr>
+            <w:cnfStyle w:val="001000000000" w:firstRow="0" w:lastRow="0" w:firstColumn="1" w:lastColumn="0" w:oddVBand="0" w:evenVBand="0" w:oddHBand="0" w:evenHBand="0" w:firstRowFirstColumn="0" w:firstRowLastColumn="0" w:lastRowFirstColumn="0" w:lastRowLastColumn="0"/>
+            <w:tcW w:w="1250" w:type="pct"/>
+            <w:tcBorders>
+              <w:top w:val="single" w:sz="4" w:space="0" w:color="000000" w:themeColor="text1"/>
+              <w:bottom w:val="single" w:sz="4" w:space="0" w:color="000000" w:themeColor="text1"/>
+              <w:right w:val="single" w:sz="4" w:space="0" w:color="000000" w:themeColor="text1"/>
+            </w:tcBorders>
+          </w:tcPr>
+          <w:p>
+            <w:r>
+              <w:t>Ice</w:t>
+            </w:r>
+          </w:p>
+        </w:tc>
+        <w:tc>
+          <w:tcPr>
+            <w:tcW w:w="1250" w:type="pct"/>
+            <w:tcBorders>
+              <w:top w:val="single" w:sz="4" w:space="0" w:color="000000" w:themeColor="text1"/>
+              <w:left w:val="single" w:sz="4" w:space="0" w:color="000000" w:themeColor="text1"/>
+              <w:bottom w:val="single" w:sz="4" w:space="0" w:color="000000" w:themeColor="text1"/>
+              <w:right w:val="single" w:sz="4" w:space="0" w:color="000000" w:themeColor="text1"/>
+            </w:tcBorders>
+          </w:tcPr>
+          <w:p>
+            <w:pPr>
+              <w:cnfStyle w:val="000000000000" w:firstRow="0" w:lastRow="0" w:firstColumn="0" w:lastColumn="0" w:oddVBand="0" w:evenVBand="0" w:oddHBand="0" w:evenHBand="0" w:firstRowFirstColumn="0" w:firstRowLastColumn="0" w:lastRowFirstColumn="0" w:lastRowLastColumn="0"/>
+            </w:pPr>
+            <w:r>
+              <w:t>0,05</w:t>
+            </w:r>
+          </w:p>
+        </w:tc>
+        <w:tc>
+          <w:tcPr>
+            <w:tcW w:w="1250" w:type="pct"/>
+            <w:tcBorders>
+              <w:top w:val="single" w:sz="4" w:space="0" w:color="000000" w:themeColor="text1"/>
+              <w:left w:val="single" w:sz="4" w:space="0" w:color="000000" w:themeColor="text1"/>
+              <w:bottom w:val="single" w:sz="4" w:space="0" w:color="000000" w:themeColor="text1"/>
+              <w:right w:val="single" w:sz="4" w:space="0" w:color="000000" w:themeColor="text1"/>
+            </w:tcBorders>
+          </w:tcPr>
+          <w:p>
+            <w:pPr>
+              <w:cnfStyle w:val="000000000000" w:firstRow="0" w:lastRow="0" w:firstColumn="0" w:lastColumn="0" w:oddVBand="0" w:evenVBand="0" w:oddHBand="0" w:evenHBand="0" w:firstRowFirstColumn="0" w:firstRowLastColumn="0" w:lastRowFirstColumn="0" w:lastRowLastColumn="0"/>
+            </w:pPr>
+            <w:r>
+              <w:t>0,10</w:t>
+            </w:r>
+          </w:p>
+        </w:tc>
+        <w:tc>
+          <w:tcPr>
+            <w:tcW w:w="1250" w:type="pct"/>
+            <w:tcBorders>
+              <w:top w:val="single" w:sz="4" w:space="0" w:color="000000" w:themeColor="text1"/>
+              <w:left w:val="single" w:sz="4" w:space="0" w:color="000000" w:themeColor="text1"/>
+              <w:bottom w:val="single" w:sz="4" w:space="0" w:color="000000" w:themeColor="text1"/>
+            </w:tcBorders>
+          </w:tcPr>
+          <w:p>
+            <w:pPr>
+              <w:cnfStyle w:val="000000000000" w:firstRow="0" w:lastRow="0" w:firstColumn="0" w:lastColumn="0" w:oddVBand="0" w:evenVBand="0" w:oddHBand="0" w:evenHBand="0" w:firstRowFirstColumn="0" w:firstRowLastColumn="0" w:lastRowFirstColumn="0" w:lastRowLastColumn="0"/>
+            </w:pPr>
+            <w:r>
+              <w:t>0,15</w:t>
+            </w:r>
+          </w:p>
+        </w:tc>
+      </w:tr>
+      <w:tr>
+        <w:trPr>
+          <w:cnfStyle w:val="000000100000" w:firstRow="0" w:lastRow="0" w:firstColumn="0" w:lastColumn="0" w:oddVBand="0" w:evenVBand="0" w:oddHBand="1" w:evenHBand="0" w:firstRowFirstColumn="0" w:firstRowLastColumn="0" w:lastRowFirstColumn="0" w:lastRowLastColumn="0"/>
+        </w:trPr>
+        <w:tc>
+          <w:tcPr>
+            <w:cnfStyle w:val="001000000000" w:firstRow="0" w:lastRow="0" w:firstColumn="1" w:lastColumn="0" w:oddVBand="0" w:evenVBand="0" w:oddHBand="0" w:evenHBand="0" w:firstRowFirstColumn="0" w:firstRowLastColumn="0" w:lastRowFirstColumn="0" w:lastRowLastColumn="0"/>
+            <w:tcW w:w="1250" w:type="pct"/>
+            <w:tcBorders>
+              <w:top w:val="single" w:sz="4" w:space="0" w:color="000000" w:themeColor="text1"/>
+              <w:bottom w:val="single" w:sz="4" w:space="0" w:color="000000" w:themeColor="text1"/>
+              <w:right w:val="single" w:sz="4" w:space="0" w:color="000000" w:themeColor="text1"/>
+            </w:tcBorders>
+          </w:tcPr>
+          <w:p>
+            <w:r>
+              <w:t>Syrup</w:t>
+            </w:r>
+          </w:p>
+        </w:tc>
+        <w:tc>
+          <w:tcPr>
+            <w:tcW w:w="1250" w:type="pct"/>
+            <w:tcBorders>
+              <w:top w:val="single" w:sz="4" w:space="0" w:color="000000" w:themeColor="text1"/>
+              <w:left w:val="single" w:sz="4" w:space="0" w:color="000000" w:themeColor="text1"/>
+              <w:bottom w:val="single" w:sz="4" w:space="0" w:color="000000" w:themeColor="text1"/>
+              <w:right w:val="single" w:sz="4" w:space="0" w:color="000000" w:themeColor="text1"/>
+            </w:tcBorders>
+          </w:tcPr>
+          <w:p>
+            <w:pPr>
+              <w:cnfStyle w:val="000000100000" w:firstRow="0" w:lastRow="0" w:firstColumn="0" w:lastColumn="0" w:oddVBand="0" w:evenVBand="0" w:oddHBand="1" w:evenHBand="0" w:firstRowFirstColumn="0" w:firstRowLastColumn="0" w:lastRowFirstColumn="0" w:lastRowLastColumn="0"/>
+            </w:pPr>
+            <w:r>
+              <w:t>0,79</w:t>
+            </w:r>
+          </w:p>
+        </w:tc>
+        <w:tc>
+          <w:tcPr>
+            <w:tcW w:w="1250" w:type="pct"/>
+            <w:tcBorders>
+              <w:top w:val="single" w:sz="4" w:space="0" w:color="000000" w:themeColor="text1"/>
+              <w:left w:val="single" w:sz="4" w:space="0" w:color="000000" w:themeColor="text1"/>
+              <w:bottom w:val="single" w:sz="4" w:space="0" w:color="000000" w:themeColor="text1"/>
+              <w:right w:val="single" w:sz="4" w:space="0" w:color="000000" w:themeColor="text1"/>
+            </w:tcBorders>
+          </w:tcPr>
+          <w:p>
+            <w:pPr>
+              <w:cnfStyle w:val="000000100000" w:firstRow="0" w:lastRow="0" w:firstColumn="0" w:lastColumn="0" w:oddVBand="0" w:evenVBand="0" w:oddHBand="1" w:evenHBand="0" w:firstRowFirstColumn="0" w:firstRowLastColumn="0" w:lastRowFirstColumn="0" w:lastRowLastColumn="0"/>
+            </w:pPr>
+            <w:r>
+              <w:t>1,05</w:t>
+            </w:r>
+          </w:p>
+        </w:tc>
+        <w:tc>
+          <w:tcPr>
+            <w:tcW w:w="1250" w:type="pct"/>
+            <w:tcBorders>
+              <w:top w:val="single" w:sz="4" w:space="0" w:color="000000" w:themeColor="text1"/>
+              <w:left w:val="single" w:sz="4" w:space="0" w:color="000000" w:themeColor="text1"/>
+              <w:bottom w:val="single" w:sz="4" w:space="0" w:color="000000" w:themeColor="text1"/>
+            </w:tcBorders>
+          </w:tcPr>
+          <w:p>
+            <w:pPr>
+              <w:cnfStyle w:val="000000100000" w:firstRow="0" w:lastRow="0" w:firstColumn="0" w:lastColumn="0" w:oddVBand="0" w:evenVBand="0" w:oddHBand="1" w:evenHBand="0" w:firstRowFirstColumn="0" w:firstRowLastColumn="0" w:lastRowFirstColumn="0" w:lastRowLastColumn="0"/>
+            </w:pPr>
+            <w:r>
+              <w:t>1,55</w:t>
+            </w:r>
+          </w:p>
+        </w:tc>
+      </w:tr>
+      <w:tr>
+        <w:tc>
+          <w:tcPr>
+            <w:cnfStyle w:val="001000000000" w:firstRow="0" w:lastRow="0" w:firstColumn="1" w:lastColumn="0" w:oddVBand="0" w:evenVBand="0" w:oddHBand="0" w:evenHBand="0" w:firstRowFirstColumn="0" w:firstRowLastColumn="0" w:lastRowFirstColumn="0" w:lastRowLastColumn="0"/>
+            <w:tcW w:w="1250" w:type="pct"/>
+            <w:tcBorders>
+              <w:top w:val="single" w:sz="4" w:space="0" w:color="000000" w:themeColor="text1"/>
+              <w:right w:val="single" w:sz="4" w:space="0" w:color="000000" w:themeColor="text1"/>
+            </w:tcBorders>
+          </w:tcPr>
+          <w:p>
+            <w:r>
+              <w:t>Whiskey</w:t>
+            </w:r>
+          </w:p>
+        </w:tc>
+        <w:tc>
+          <w:tcPr>
+            <w:tcW w:w="1250" w:type="pct"/>
+            <w:tcBorders>
+              <w:top w:val="single" w:sz="4" w:space="0" w:color="000000" w:themeColor="text1"/>
+              <w:left w:val="single" w:sz="4" w:space="0" w:color="000000" w:themeColor="text1"/>
+              <w:right w:val="single" w:sz="4" w:space="0" w:color="000000" w:themeColor="text1"/>
+            </w:tcBorders>
+          </w:tcPr>
+          <w:p>
+            <w:pPr>
+              <w:cnfStyle w:val="000000000000" w:firstRow="0" w:lastRow="0" w:firstColumn="0" w:lastColumn="0" w:oddVBand="0" w:evenVBand="0" w:oddHBand="0" w:evenHBand="0" w:firstRowFirstColumn="0" w:firstRowLastColumn="0" w:lastRowFirstColumn="0" w:lastRowLastColumn="0"/>
+            </w:pPr>
+            <w:r>
+              <w:t>2,00</w:t>
+            </w:r>
+          </w:p>
+        </w:tc>
+        <w:tc>
+          <w:tcPr>
+            <w:tcW w:w="1250" w:type="pct"/>
+            <w:tcBorders>
+              <w:top w:val="single" w:sz="4" w:space="0" w:color="000000" w:themeColor="text1"/>
+              <w:left w:val="single" w:sz="4" w:space="0" w:color="000000" w:themeColor="text1"/>
+              <w:right w:val="single" w:sz="4" w:space="0" w:color="000000" w:themeColor="text1"/>
+            </w:tcBorders>
+          </w:tcPr>
+          <w:p>
+            <w:pPr>
+              <w:cnfStyle w:val="000000000000" w:firstRow="0" w:lastRow="0" w:firstColumn="0" w:lastColumn="0" w:oddVBand="0" w:evenVBand="0" w:oddHBand="0" w:evenHBand="0" w:firstRowFirstColumn="0" w:firstRowLastColumn="0" w:lastRowFirstColumn="0" w:lastRowLastColumn="0"/>
+            </w:pPr>
+            <w:r>
+              <w:t>3,00</w:t>
+            </w:r>
+          </w:p>
+        </w:tc>
+        <w:tc>
+          <w:tcPr>
+            <w:tcW w:w="1250" w:type="pct"/>
+            <w:tcBorders>
+              <w:top w:val="single" w:sz="4" w:space="0" w:color="000000" w:themeColor="text1"/>
+              <w:left w:val="single" w:sz="4" w:space="0" w:color="000000" w:themeColor="text1"/>
+            </w:tcBorders>
+          </w:tcPr>
+          <w:p>
+            <w:pPr>
+              <w:cnfStyle w:val="000000000000" w:firstRow="0" w:lastRow="0" w:firstColumn="0" w:lastColumn="0" w:oddVBand="0" w:evenVBand="0" w:oddHBand="0" w:evenHBand="0" w:firstRowFirstColumn="0" w:firstRowLastColumn="0" w:lastRowFirstColumn="0" w:lastRowLastColumn="0"/>
+            </w:pPr>
+            <w:r>
+              <w:t>4,00</w:t>
+            </w:r>
+          </w:p>
+        </w:tc>
+      </w:tr>
+    </w:tbl>
     <w:p>
       <w:pPr>
         <w:pStyle w:val="Kop1"/>
       </w:pPr>
-      <w:bookmarkStart w:id="3" w:name="_Toc144047734"/>
+      <w:bookmarkStart w:id="3" w:name="_Toc242184846"/>
       <w:r>
         <w:t>Opdracht #</w:t>
       </w:r>
@@ -3589,14 +4586,9 @@
         <w:t>4</w:t>
       </w:r>
       <w:r>
-        <w:t xml:space="preserve"> – </w:t>
-      </w:r>
-      <w:proofErr w:type="spellStart"/>
-      <w:r>
-        <w:t>Testing</w:t>
+        <w:t xml:space="preserve"> – Testing</w:t>
       </w:r>
       <w:bookmarkEnd w:id="3"/>
-      <w:proofErr w:type="spellEnd"/>
       <w:r>
         <w:t xml:space="preserve"> </w:t>
       </w:r>
@@ -3604,71 +4596,77 @@
     <w:p>
       <w:pPr>
         <w:pStyle w:val="Geenafstand"/>
+        <w:rPr>
+          <w:sz w:val="28"/>
+          <w:szCs w:val="28"/>
+        </w:rPr>
       </w:pPr>
       <w:r>
-        <w:t>Maak één van iedere koffie variant</w:t>
+        <w:rPr>
+          <w:sz w:val="28"/>
+          <w:szCs w:val="28"/>
+        </w:rPr>
+        <w:t>Maak één</w:t>
       </w:r>
       <w:r>
-        <w:t xml:space="preserve"> aan in de </w:t>
-      </w:r>
-      <w:proofErr w:type="spellStart"/>
-      <w:proofErr w:type="gramStart"/>
-      <w:r>
-        <w:t>Main</w:t>
-      </w:r>
-      <w:proofErr w:type="spellEnd"/>
-      <w:r>
-        <w:t>(</w:t>
-      </w:r>
-      <w:proofErr w:type="gramEnd"/>
-      <w:r>
-        <w:t>)</w:t>
+        <w:rPr>
+          <w:sz w:val="28"/>
+          <w:szCs w:val="28"/>
+        </w:rPr>
+        <w:t xml:space="preserve"> instantie van</w:t>
       </w:r>
       <w:r>
-        <w:t xml:space="preserve"> en print deze uit d.m.v. de print functie in </w:t>
-      </w:r>
-      <w:proofErr w:type="spellStart"/>
-      <w:r>
-        <w:t>Program.cs</w:t>
-      </w:r>
-      <w:proofErr w:type="spellEnd"/>
-      <w:r>
-        <w:t>.</w:t>
+        <w:rPr>
+          <w:sz w:val="28"/>
+          <w:szCs w:val="28"/>
+        </w:rPr>
+        <w:t xml:space="preserve"> iedere koffie variant</w:t>
       </w:r>
       <w:r>
+        <w:rPr>
+          <w:sz w:val="28"/>
+          <w:szCs w:val="28"/>
+        </w:rPr>
+        <w:t xml:space="preserve"> aan in de Main()</w:t>
+      </w:r>
+      <w:r>
+        <w:rPr>
+          <w:sz w:val="28"/>
+          <w:szCs w:val="28"/>
+        </w:rPr>
+        <w:t xml:space="preserve"> en print deze uit d.m.v. de print functie in Program.cs.</w:t>
+      </w:r>
+      <w:r>
+        <w:rPr>
+          <w:sz w:val="28"/>
+          <w:szCs w:val="28"/>
+        </w:rPr>
         <w:t xml:space="preserve"> </w:t>
       </w:r>
     </w:p>
     <w:p>
       <w:pPr>
         <w:pStyle w:val="Geenafstand"/>
+        <w:rPr>
+          <w:sz w:val="28"/>
+          <w:szCs w:val="28"/>
+        </w:rPr>
       </w:pPr>
     </w:p>
     <w:p>
       <w:pPr>
         <w:pStyle w:val="Geenafstand"/>
+        <w:rPr>
+          <w:sz w:val="28"/>
+          <w:szCs w:val="28"/>
+        </w:rPr>
       </w:pPr>
       <w:r>
-        <w:t xml:space="preserve">Voorbeelden van espresso, </w:t>
-      </w:r>
-      <w:proofErr w:type="spellStart"/>
-      <w:r>
-        <w:t>lungo</w:t>
-      </w:r>
-      <w:proofErr w:type="spellEnd"/>
-      <w:r>
-        <w:t xml:space="preserve"> e</w:t>
-      </w:r>
-      <w:r>
-        <w:t xml:space="preserve">n </w:t>
-      </w:r>
-      <w:proofErr w:type="spellStart"/>
-      <w:r>
-        <w:t>americano</w:t>
-      </w:r>
-      <w:proofErr w:type="spellEnd"/>
-      <w:r>
-        <w:t xml:space="preserve"> zijn gegeven.</w:t>
+        <w:rPr>
+          <w:sz w:val="28"/>
+          <w:szCs w:val="28"/>
+        </w:rPr>
+        <w:t>Voorbeelden van espresso, lungo en americano zijn gegeven.</w:t>
       </w:r>
     </w:p>
     <w:p>
@@ -8017,6 +9015,7 @@
   <w:style w:type="character" w:default="1" w:styleId="Standaardalinea-lettertype">
     <w:name w:val="Default Paragraph Font"/>
     <w:uiPriority w:val="1"/>
+    <w:semiHidden/>
     <w:unhideWhenUsed/>
   </w:style>
   <w:style w:type="table" w:default="1" w:styleId="Standaardtabel">
@@ -9643,10 +10642,18 @@
 
 <file path=customXml/item1.xml><?xml version="1.0" encoding="utf-8"?>
 <?mso-contentType ?>
-<SharedContentType xmlns="Microsoft.SharePoint.Taxonomy.ContentTypeSync" SourceId="96173d46-5f7d-49bf-a64d-4dd4f1c458b8" ContentTypeId="0x0101" PreviousValue="false"/>
+<FormTemplates xmlns="http://schemas.microsoft.com/sharepoint/v3/contenttype/forms">
+  <Display>DocumentLibraryForm</Display>
+  <Edit>DocumentLibraryForm</Edit>
+  <New>DocumentLibraryForm</New>
+</FormTemplates>
 </file>
 
 <file path=customXml/item2.xml><?xml version="1.0" encoding="utf-8"?>
+<b:Sources xmlns:b="http://schemas.openxmlformats.org/officeDocument/2006/bibliography" xmlns="http://schemas.openxmlformats.org/officeDocument/2006/bibliography" SelectedStyle="/APASixthEditionOfficeOnline.xsl" StyleName="APA" Version="6"/>
+</file>
+
+<file path=customXml/item3.xml><?xml version="1.0" encoding="utf-8"?>
 <ct:contentTypeSchema xmlns:ct="http://schemas.microsoft.com/office/2006/metadata/contentType" xmlns:ma="http://schemas.microsoft.com/office/2006/metadata/properties/metaAttributes" ct:_="" ma:_="" ma:contentTypeName="Document" ma:contentTypeID="0x0101001E178663C6C1154FBF9CBC32AA8D1BC4" ma:contentTypeVersion="22" ma:contentTypeDescription="Een nieuw document maken." ma:contentTypeScope="" ma:versionID="47f77be9a0c5f5b4b34c5faee078f337">
   <xsd:schema xmlns:xsd="http://www.w3.org/2001/XMLSchema" xmlns:xs="http://www.w3.org/2001/XMLSchema" xmlns:p="http://schemas.microsoft.com/office/2006/metadata/properties" xmlns:ns2="bd273f67-5965-45f0-ac4e-d17ce83175e7" xmlns:ns3="e1a4e582-16c8-4a73-92d0-82596f5157ed" targetNamespace="http://schemas.microsoft.com/office/2006/metadata/properties" ma:root="true" ma:fieldsID="36b3ab4c297465ff3789a23bb29b951e" ns2:_="" ns3:_="">
     <xsd:import namespace="bd273f67-5965-45f0-ac4e-d17ce83175e7"/>
@@ -9901,17 +10908,9 @@
 </ct:contentTypeSchema>
 </file>
 
-<file path=customXml/item3.xml><?xml version="1.0" encoding="utf-8"?>
-<b:Sources xmlns:b="http://schemas.openxmlformats.org/officeDocument/2006/bibliography" xmlns="http://schemas.openxmlformats.org/officeDocument/2006/bibliography" SelectedStyle="/APASixthEditionOfficeOnline.xsl" StyleName="APA" Version="6"/>
-</file>
-
 <file path=customXml/item4.xml><?xml version="1.0" encoding="utf-8"?>
 <?mso-contentType ?>
-<FormTemplates xmlns="http://schemas.microsoft.com/sharepoint/v3/contenttype/forms">
-  <Display>DocumentLibraryForm</Display>
-  <Edit>DocumentLibraryForm</Edit>
-  <New>DocumentLibraryForm</New>
-</FormTemplates>
+<SharedContentType xmlns="Microsoft.SharePoint.Taxonomy.ContentTypeSync" SourceId="96173d46-5f7d-49bf-a64d-4dd4f1c458b8" ContentTypeId="0x0101" PreviousValue="false"/>
 </file>
 
 <file path=customXml/item5.xml><?xml version="1.0" encoding="utf-8"?>
@@ -9926,14 +10925,22 @@
 </file>
 
 <file path=customXml/itemProps1.xml><?xml version="1.0" encoding="utf-8"?>
-<ds:datastoreItem xmlns:ds="http://schemas.openxmlformats.org/officeDocument/2006/customXml" ds:itemID="{C036E063-0501-4A91-AF28-5142A9D2AD7E}">
+<ds:datastoreItem xmlns:ds="http://schemas.openxmlformats.org/officeDocument/2006/customXml" ds:itemID="{A25B3578-7C9B-41F5-A14A-14B3F302CC6A}">
   <ds:schemaRefs>
-    <ds:schemaRef ds:uri="Microsoft.SharePoint.Taxonomy.ContentTypeSync"/>
+    <ds:schemaRef ds:uri="http://schemas.microsoft.com/sharepoint/v3/contenttype/forms"/>
   </ds:schemaRefs>
 </ds:datastoreItem>
 </file>
 
 <file path=customXml/itemProps2.xml><?xml version="1.0" encoding="utf-8"?>
+<ds:datastoreItem xmlns:ds="http://schemas.openxmlformats.org/officeDocument/2006/customXml" ds:itemID="{6EC07A6A-086E-6045-A911-CB4E4D508AFB}">
+  <ds:schemaRefs>
+    <ds:schemaRef ds:uri="http://schemas.openxmlformats.org/officeDocument/2006/bibliography"/>
+  </ds:schemaRefs>
+</ds:datastoreItem>
+</file>
+
+<file path=customXml/itemProps3.xml><?xml version="1.0" encoding="utf-8"?>
 <ds:datastoreItem xmlns:ds="http://schemas.openxmlformats.org/officeDocument/2006/customXml" ds:itemID="{90ADE403-0BDB-4C79-AAA6-684237D30F6B}">
   <ds:schemaRefs>
     <ds:schemaRef ds:uri="http://schemas.microsoft.com/office/2006/metadata/contentType"/>
@@ -9952,18 +10959,10 @@
 </ds:datastoreItem>
 </file>
 
-<file path=customXml/itemProps3.xml><?xml version="1.0" encoding="utf-8"?>
-<ds:datastoreItem xmlns:ds="http://schemas.openxmlformats.org/officeDocument/2006/customXml" ds:itemID="{6EC07A6A-086E-6045-A911-CB4E4D508AFB}">
+<file path=customXml/itemProps4.xml><?xml version="1.0" encoding="utf-8"?>
+<ds:datastoreItem xmlns:ds="http://schemas.openxmlformats.org/officeDocument/2006/customXml" ds:itemID="{C036E063-0501-4A91-AF28-5142A9D2AD7E}">
   <ds:schemaRefs>
-    <ds:schemaRef ds:uri="http://schemas.openxmlformats.org/officeDocument/2006/bibliography"/>
-  </ds:schemaRefs>
-</ds:datastoreItem>
-</file>
-
-<file path=customXml/itemProps4.xml><?xml version="1.0" encoding="utf-8"?>
-<ds:datastoreItem xmlns:ds="http://schemas.openxmlformats.org/officeDocument/2006/customXml" ds:itemID="{A25B3578-7C9B-41F5-A14A-14B3F302CC6A}">
-  <ds:schemaRefs>
-    <ds:schemaRef ds:uri="http://schemas.microsoft.com/sharepoint/v3/contenttype/forms"/>
+    <ds:schemaRef ds:uri="Microsoft.SharePoint.Taxonomy.ContentTypeSync"/>
   </ds:schemaRefs>
 </ds:datastoreItem>
 </file>

</xml_diff>